<commit_message>
Add edit Docx midterm
</commit_message>
<xml_diff>
--- a/67160177.docx
+++ b/67160177.docx
@@ -2,8 +2,2986 @@
 <file path=word/document.xml><?xml version="1.0" encoding="utf-8"?>
 <w:document xmlns:wpc="http://schemas.microsoft.com/office/word/2010/wordprocessingCanvas" xmlns:cx="http://schemas.microsoft.com/office/drawing/2014/chartex" xmlns:cx1="http://schemas.microsoft.com/office/drawing/2015/9/8/chartex" xmlns:cx2="http://schemas.microsoft.com/office/drawing/2015/10/21/chartex" xmlns:cx3="http://schemas.microsoft.com/office/drawing/2016/5/9/chartex" xmlns:cx4="http://schemas.microsoft.com/office/drawing/2016/5/10/chartex" xmlns:cx5="http://schemas.microsoft.com/office/drawing/2016/5/11/chartex" xmlns:cx6="http://schemas.microsoft.com/office/drawing/2016/5/12/chartex" xmlns:cx7="http://schemas.microsoft.com/office/drawing/2016/5/13/chartex" xmlns:cx8="http://schemas.microsoft.com/office/drawing/2016/5/14/chartex" xmlns:mc="http://schemas.openxmlformats.org/markup-compatibility/2006" xmlns:aink="http://schemas.microsoft.com/office/drawing/2016/ink" xmlns:am3d="http://schemas.microsoft.com/office/drawing/2017/model3d" xmlns:o="urn:schemas-microsoft-com:office:office" xmlns:oel="http://schemas.microsoft.com/office/2019/extlst" xmlns:r="http://schemas.openxmlformats.org/officeDocument/2006/relationships" xmlns:m="http://schemas.openxmlformats.org/officeDocument/2006/math" xmlns:v="urn:schemas-microsoft-com:vml" xmlns:wp14="http://schemas.microsoft.com/office/word/2010/wordprocessingDrawing" xmlns:wp="http://schemas.openxmlformats.org/drawingml/2006/wordprocessingDrawing" xmlns:w10="urn:schemas-microsoft-com:office:word" xmlns:w="http://schemas.openxmlformats.org/wordprocessingml/2006/main" xmlns:w14="http://schemas.microsoft.com/office/word/2010/wordml" xmlns:w15="http://schemas.microsoft.com/office/word/2012/wordml" xmlns:w16cex="http://schemas.microsoft.com/office/word/2018/wordml/cex" xmlns:w16cid="http://schemas.microsoft.com/office/word/2016/wordml/cid" xmlns:w16="http://schemas.microsoft.com/office/word/2018/wordml" xmlns:w16sdtdh="http://schemas.microsoft.com/office/word/2020/wordml/sdtdatahash" xmlns:w16se="http://schemas.microsoft.com/office/word/2015/wordml/symex" xmlns:wpg="http://schemas.microsoft.com/office/word/2010/wordprocessingGroup" xmlns:wpi="http://schemas.microsoft.com/office/word/2010/wordprocessingInk" xmlns:wne="http://schemas.microsoft.com/office/word/2006/wordml" xmlns:wps="http://schemas.microsoft.com/office/word/2010/wordprocessingShape" mc:Ignorable="w14 w15 w16se w16cid w16 w16cex w16sdtdh wp14">
   <w:body>
-    <w:p/>
+    <w:p>
+      <w:r>
+        <w:drawing>
+          <wp:inline distT="0" distB="0" distL="0" distR="0" wp14:anchorId="608B3C53" wp14:editId="70C16C62">
+            <wp:extent cx="5731510" cy="4155440"/>
+            <wp:effectExtent l="0" t="0" r="2540" b="0"/>
+            <wp:docPr id="1" name="Picture 1"/>
+            <wp:cNvGraphicFramePr>
+              <a:graphicFrameLocks xmlns:a="http://schemas.openxmlformats.org/drawingml/2006/main" noChangeAspect="1"/>
+            </wp:cNvGraphicFramePr>
+            <a:graphic xmlns:a="http://schemas.openxmlformats.org/drawingml/2006/main">
+              <a:graphicData uri="http://schemas.openxmlformats.org/drawingml/2006/picture">
+                <pic:pic xmlns:pic="http://schemas.openxmlformats.org/drawingml/2006/picture">
+                  <pic:nvPicPr>
+                    <pic:cNvPr id="1" name=""/>
+                    <pic:cNvPicPr/>
+                  </pic:nvPicPr>
+                  <pic:blipFill>
+                    <a:blip r:embed="rId6"/>
+                    <a:stretch>
+                      <a:fillRect/>
+                    </a:stretch>
+                  </pic:blipFill>
+                  <pic:spPr>
+                    <a:xfrm>
+                      <a:off x="0" y="0"/>
+                      <a:ext cx="5731510" cy="4155440"/>
+                    </a:xfrm>
+                    <a:prstGeom prst="rect">
+                      <a:avLst/>
+                    </a:prstGeom>
+                  </pic:spPr>
+                </pic:pic>
+              </a:graphicData>
+            </a:graphic>
+          </wp:inline>
+        </w:drawing>
+      </w:r>
+    </w:p>
+    <w:p>
+      <w:r>
+        <w:t>&lt;!DOCTYPE html&gt;</w:t>
+      </w:r>
+    </w:p>
+    <w:p>
+      <w:r>
+        <w:t>&lt;html lang="</w:t>
+      </w:r>
+      <w:proofErr w:type="spellStart"/>
+      <w:r>
+        <w:t>th</w:t>
+      </w:r>
+      <w:proofErr w:type="spellEnd"/>
+      <w:r>
+        <w:t>"&gt;</w:t>
+      </w:r>
+    </w:p>
+    <w:p>
+      <w:r>
+        <w:t>&lt;head&gt;</w:t>
+      </w:r>
+    </w:p>
+    <w:p>
+      <w:r>
+        <w:t>  &lt;meta charset="UTF-8"&gt;</w:t>
+      </w:r>
+    </w:p>
+    <w:p>
+      <w:r>
+        <w:t>  &lt;title&gt;Grade Calculator&lt;/title&gt;</w:t>
+      </w:r>
+    </w:p>
+    <w:p/>
+    <w:p>
+      <w:r>
+        <w:t>  &lt;style&gt;</w:t>
+      </w:r>
+    </w:p>
+    <w:p/>
+    <w:p>
+      <w:r>
+        <w:t>/* ===== Page ===== */</w:t>
+      </w:r>
+    </w:p>
+    <w:p>
+      <w:r>
+        <w:t>body {</w:t>
+      </w:r>
+    </w:p>
+    <w:p>
+      <w:r>
+        <w:t>  background-color: #333333;</w:t>
+      </w:r>
+    </w:p>
+    <w:p>
+      <w:r>
+        <w:t>  font-family: "Segoe UI", Tahoma, sans-serif;</w:t>
+      </w:r>
+    </w:p>
+    <w:p>
+      <w:r>
+        <w:t>}</w:t>
+      </w:r>
+    </w:p>
+    <w:p/>
+    <w:p>
+      <w:r>
+        <w:t>/* ===== Container ===== */</w:t>
+      </w:r>
+    </w:p>
+    <w:p>
+      <w:r>
+        <w:t>.container {</w:t>
+      </w:r>
+    </w:p>
+    <w:p>
+      <w:r>
+        <w:lastRenderedPageBreak/>
+        <w:t>  max-width: 600px;</w:t>
+      </w:r>
+    </w:p>
+    <w:p>
+      <w:r>
+        <w:t>  margin: 40px auto;</w:t>
+      </w:r>
+    </w:p>
+    <w:p>
+      <w:r>
+        <w:t>  padding: 30px;</w:t>
+      </w:r>
+    </w:p>
+    <w:p>
+      <w:r>
+        <w:t>  background: #ffffff;</w:t>
+      </w:r>
+    </w:p>
+    <w:p>
+      <w:r>
+        <w:t>  border-radius: 12px;</w:t>
+      </w:r>
+    </w:p>
+    <w:p>
+      <w:r>
+        <w:t xml:space="preserve">  box-shadow: 0 8px 20px </w:t>
+      </w:r>
+      <w:proofErr w:type="spellStart"/>
+      <w:proofErr w:type="gramStart"/>
+      <w:r>
+        <w:t>rgba</w:t>
+      </w:r>
+      <w:proofErr w:type="spellEnd"/>
+      <w:r>
+        <w:t>(</w:t>
+      </w:r>
+      <w:proofErr w:type="gramEnd"/>
+      <w:r>
+        <w:t>0, 0, 0, 0.08);</w:t>
+      </w:r>
+    </w:p>
+    <w:p>
+      <w:r>
+        <w:t>}</w:t>
+      </w:r>
+    </w:p>
+    <w:p/>
+    <w:p>
+      <w:r>
+        <w:t>/* ===== Title ===== */</w:t>
+      </w:r>
+    </w:p>
+    <w:p>
+      <w:r>
+        <w:t>h2 {</w:t>
+      </w:r>
+    </w:p>
+    <w:p>
+      <w:r>
+        <w:t>  text-align: center;</w:t>
+      </w:r>
+    </w:p>
+    <w:p>
+      <w:r>
+        <w:t>  margin-bottom: 25px;</w:t>
+      </w:r>
+    </w:p>
+    <w:p>
+      <w:r>
+        <w:t>  color: #333;</w:t>
+      </w:r>
+    </w:p>
+    <w:p>
+      <w:r>
+        <w:t>}</w:t>
+      </w:r>
+    </w:p>
+    <w:p/>
+    <w:p>
+      <w:r>
+        <w:t>/* ===== Form Row ===== */</w:t>
+      </w:r>
+    </w:p>
+    <w:p>
+      <w:proofErr w:type="gramStart"/>
+      <w:r>
+        <w:t>.form</w:t>
+      </w:r>
+      <w:proofErr w:type="gramEnd"/>
+      <w:r>
+        <w:t>-row {</w:t>
+      </w:r>
+    </w:p>
+    <w:p>
+      <w:r>
+        <w:t>  display: flex;</w:t>
+      </w:r>
+    </w:p>
+    <w:p>
+      <w:r>
+        <w:t>  align-items: center;</w:t>
+      </w:r>
+    </w:p>
+    <w:p>
+      <w:r>
+        <w:t>  margin-bottom: 15px;</w:t>
+      </w:r>
+    </w:p>
+    <w:p>
+      <w:r>
+        <w:t>}</w:t>
+      </w:r>
+    </w:p>
+    <w:p/>
+    <w:p>
+      <w:proofErr w:type="gramStart"/>
+      <w:r>
+        <w:t>.form</w:t>
+      </w:r>
+      <w:proofErr w:type="gramEnd"/>
+      <w:r>
+        <w:t>-row label {</w:t>
+      </w:r>
+    </w:p>
+    <w:p>
+      <w:r>
+        <w:t>  width: 160px;</w:t>
+      </w:r>
+    </w:p>
+    <w:p>
+      <w:r>
+        <w:t>  font-weight: 600;</w:t>
+      </w:r>
+    </w:p>
+    <w:p>
+      <w:r>
+        <w:t>  color: #444;</w:t>
+      </w:r>
+    </w:p>
+    <w:p>
+      <w:r>
+        <w:t>}</w:t>
+      </w:r>
+    </w:p>
+    <w:p/>
+    <w:p>
+      <w:proofErr w:type="gramStart"/>
+      <w:r>
+        <w:t>.form</w:t>
+      </w:r>
+      <w:proofErr w:type="gramEnd"/>
+      <w:r>
+        <w:t>-row input {</w:t>
+      </w:r>
+    </w:p>
+    <w:p>
+      <w:r>
+        <w:t>  flex: 1;</w:t>
+      </w:r>
+    </w:p>
+    <w:p>
+      <w:r>
+        <w:t>  padding: 10px 12px;</w:t>
+      </w:r>
+    </w:p>
+    <w:p>
+      <w:r>
+        <w:lastRenderedPageBreak/>
+        <w:t>  border-radius: 6px;</w:t>
+      </w:r>
+    </w:p>
+    <w:p>
+      <w:r>
+        <w:t>  border: 1.5px solid #ccc;</w:t>
+      </w:r>
+    </w:p>
+    <w:p>
+      <w:r>
+        <w:t>  font-size: 15px;</w:t>
+      </w:r>
+    </w:p>
+    <w:p>
+      <w:r>
+        <w:t>  transition: 0.2s;</w:t>
+      </w:r>
+    </w:p>
+    <w:p>
+      <w:r>
+        <w:t>}</w:t>
+      </w:r>
+    </w:p>
+    <w:p/>
+    <w:p>
+      <w:proofErr w:type="gramStart"/>
+      <w:r>
+        <w:t>.form</w:t>
+      </w:r>
+      <w:proofErr w:type="gramEnd"/>
+      <w:r>
+        <w:t xml:space="preserve">-row </w:t>
+      </w:r>
+      <w:proofErr w:type="spellStart"/>
+      <w:r>
+        <w:t>input:focus</w:t>
+      </w:r>
+      <w:proofErr w:type="spellEnd"/>
+      <w:r>
+        <w:t xml:space="preserve"> {</w:t>
+      </w:r>
+    </w:p>
+    <w:p>
+      <w:r>
+        <w:t>  outline: none;</w:t>
+      </w:r>
+    </w:p>
+    <w:p>
+      <w:r>
+        <w:t>  border-color: #007bff;</w:t>
+      </w:r>
+    </w:p>
+    <w:p>
+      <w:r>
+        <w:t>  background-color: #f9fcff;</w:t>
+      </w:r>
+    </w:p>
+    <w:p>
+      <w:r>
+        <w:t>}</w:t>
+      </w:r>
+    </w:p>
+    <w:p/>
+    <w:p>
+      <w:r>
+        <w:t>/* ===== Buttons ===== */</w:t>
+      </w:r>
+    </w:p>
+    <w:p>
+      <w:proofErr w:type="gramStart"/>
+      <w:r>
+        <w:t>.button</w:t>
+      </w:r>
+      <w:proofErr w:type="gramEnd"/>
+      <w:r>
+        <w:t>-group {</w:t>
+      </w:r>
+    </w:p>
+    <w:p>
+      <w:r>
+        <w:t>  display: flex;</w:t>
+      </w:r>
+    </w:p>
+    <w:p>
+      <w:r>
+        <w:t>  justify-content: space-between;</w:t>
+      </w:r>
+    </w:p>
+    <w:p>
+      <w:r>
+        <w:t>  margin-top: 25px;</w:t>
+      </w:r>
+    </w:p>
+    <w:p>
+      <w:r>
+        <w:t>}</w:t>
+      </w:r>
+    </w:p>
+    <w:p/>
+    <w:p>
+      <w:r>
+        <w:t>button {</w:t>
+      </w:r>
+    </w:p>
+    <w:p>
+      <w:r>
+        <w:t>  width: 48%;</w:t>
+      </w:r>
+    </w:p>
+    <w:p>
+      <w:r>
+        <w:t>  padding: 12px;</w:t>
+      </w:r>
+    </w:p>
+    <w:p>
+      <w:r>
+        <w:t>  font-size: 16px;</w:t>
+      </w:r>
+    </w:p>
+    <w:p>
+      <w:r>
+        <w:t>  font-weight: 600;</w:t>
+      </w:r>
+    </w:p>
+    <w:p>
+      <w:r>
+        <w:t>  border-radius: 8px;</w:t>
+      </w:r>
+    </w:p>
+    <w:p>
+      <w:r>
+        <w:t>  border: none;</w:t>
+      </w:r>
+    </w:p>
+    <w:p>
+      <w:r>
+        <w:t>  cursor: pointer;</w:t>
+      </w:r>
+    </w:p>
+    <w:p>
+      <w:r>
+        <w:t>  transition: 0.2s;</w:t>
+      </w:r>
+    </w:p>
+    <w:p>
+      <w:r>
+        <w:t>}</w:t>
+      </w:r>
+    </w:p>
+    <w:p/>
+    <w:p>
+      <w:r>
+        <w:t>#btn-calculate {</w:t>
+      </w:r>
+    </w:p>
+    <w:p>
+      <w:r>
+        <w:lastRenderedPageBreak/>
+        <w:t>  background-color: #007bff;</w:t>
+      </w:r>
+    </w:p>
+    <w:p>
+      <w:r>
+        <w:t>  color: white;</w:t>
+      </w:r>
+    </w:p>
+    <w:p>
+      <w:r>
+        <w:t>}</w:t>
+      </w:r>
+    </w:p>
+    <w:p/>
+    <w:p>
+      <w:r>
+        <w:t>#btn-</w:t>
+      </w:r>
+      <w:proofErr w:type="gramStart"/>
+      <w:r>
+        <w:t>calculate:hover</w:t>
+      </w:r>
+      <w:proofErr w:type="gramEnd"/>
+      <w:r>
+        <w:t xml:space="preserve"> {</w:t>
+      </w:r>
+    </w:p>
+    <w:p>
+      <w:r>
+        <w:t>  background-color: #0056b3;</w:t>
+      </w:r>
+    </w:p>
+    <w:p>
+      <w:r>
+        <w:t>}</w:t>
+      </w:r>
+    </w:p>
+    <w:p/>
+    <w:p>
+      <w:r>
+        <w:t>#btn-clear {</w:t>
+      </w:r>
+    </w:p>
+    <w:p>
+      <w:r>
+        <w:t>  background-color: #e0e0e0;</w:t>
+      </w:r>
+    </w:p>
+    <w:p>
+      <w:r>
+        <w:t>  color: #333;</w:t>
+      </w:r>
+    </w:p>
+    <w:p>
+      <w:r>
+        <w:t>}</w:t>
+      </w:r>
+    </w:p>
+    <w:p/>
+    <w:p>
+      <w:r>
+        <w:t>#btn-</w:t>
+      </w:r>
+      <w:proofErr w:type="gramStart"/>
+      <w:r>
+        <w:t>clear:hover</w:t>
+      </w:r>
+      <w:proofErr w:type="gramEnd"/>
+      <w:r>
+        <w:t xml:space="preserve"> {</w:t>
+      </w:r>
+    </w:p>
+    <w:p>
+      <w:r>
+        <w:t>  background-color: #cfcfcf;</w:t>
+      </w:r>
+    </w:p>
+    <w:p>
+      <w:r>
+        <w:t>}</w:t>
+      </w:r>
+    </w:p>
+    <w:p/>
+    <w:p>
+      <w:r>
+        <w:t>/* ===== Result Box ===== */</w:t>
+      </w:r>
+    </w:p>
+    <w:p>
+      <w:r>
+        <w:t>#result-container {</w:t>
+      </w:r>
+    </w:p>
+    <w:p>
+      <w:r>
+        <w:t>  margin-top: 25px;</w:t>
+      </w:r>
+    </w:p>
+    <w:p>
+      <w:r>
+        <w:t>  padding: 18px;</w:t>
+      </w:r>
+    </w:p>
+    <w:p>
+      <w:r>
+        <w:t>  background-color: #f1f8ff;</w:t>
+      </w:r>
+    </w:p>
+    <w:p>
+      <w:r>
+        <w:t>  border-left: 5px solid #007bff;</w:t>
+      </w:r>
+    </w:p>
+    <w:p>
+      <w:r>
+        <w:t>  border-radius: 8px;</w:t>
+      </w:r>
+    </w:p>
+    <w:p>
+      <w:r>
+        <w:t>}</w:t>
+      </w:r>
+    </w:p>
+    <w:p/>
+    <w:p>
+      <w:r>
+        <w:t>#result-container p {</w:t>
+      </w:r>
+    </w:p>
+    <w:p>
+      <w:r>
+        <w:t>  margin: 8px 0;</w:t>
+      </w:r>
+    </w:p>
+    <w:p>
+      <w:r>
+        <w:t>  font-size: 16px;</w:t>
+      </w:r>
+    </w:p>
+    <w:p>
+      <w:r>
+        <w:t>}</w:t>
+      </w:r>
+    </w:p>
+    <w:p/>
+    <w:p>
+      <w:r>
+        <w:lastRenderedPageBreak/>
+        <w:t>#final-grade {</w:t>
+      </w:r>
+    </w:p>
+    <w:p>
+      <w:r>
+        <w:t>  font-weight: bold;</w:t>
+      </w:r>
+    </w:p>
+    <w:p>
+      <w:r>
+        <w:t>  font-size: 18px;</w:t>
+      </w:r>
+    </w:p>
+    <w:p>
+      <w:r>
+        <w:t>  color: #007bff;</w:t>
+      </w:r>
+    </w:p>
+    <w:p>
+      <w:r>
+        <w:t>}</w:t>
+      </w:r>
+    </w:p>
+    <w:p/>
+    <w:p>
+      <w:r>
+        <w:t>#pass-status {</w:t>
+      </w:r>
+    </w:p>
+    <w:p>
+      <w:r>
+        <w:t>  font-weight: bold;</w:t>
+      </w:r>
+    </w:p>
+    <w:p>
+      <w:r>
+        <w:t>}</w:t>
+      </w:r>
+    </w:p>
+    <w:p/>
+    <w:p>
+      <w:proofErr w:type="gramStart"/>
+      <w:r>
+        <w:t>.result</w:t>
+      </w:r>
+      <w:proofErr w:type="gramEnd"/>
+      <w:r>
+        <w:t>-item {</w:t>
+      </w:r>
+    </w:p>
+    <w:p>
+      <w:r>
+        <w:t>  background: #ffffff;</w:t>
+      </w:r>
+    </w:p>
+    <w:p>
+      <w:r>
+        <w:t>  padding: 12px;</w:t>
+      </w:r>
+    </w:p>
+    <w:p>
+      <w:r>
+        <w:t>  margin-bottom: 10px;</w:t>
+      </w:r>
+    </w:p>
+    <w:p>
+      <w:r>
+        <w:t>  border-left: 4px solid #007bff;</w:t>
+      </w:r>
+    </w:p>
+    <w:p>
+      <w:r>
+        <w:t>  border-radius: 6px;</w:t>
+      </w:r>
+    </w:p>
+    <w:p>
+      <w:r>
+        <w:t>  font-size: 15px;</w:t>
+      </w:r>
+    </w:p>
+    <w:p>
+      <w:r>
+        <w:t>}</w:t>
+      </w:r>
+    </w:p>
+    <w:p/>
+    <w:p>
+      <w:r>
+        <w:t>  &lt;/style&gt;</w:t>
+      </w:r>
+    </w:p>
+    <w:p>
+      <w:r>
+        <w:t>&lt;/head&gt;</w:t>
+      </w:r>
+    </w:p>
+    <w:p/>
+    <w:p>
+      <w:r>
+        <w:t>&lt;body&gt;</w:t>
+      </w:r>
+    </w:p>
+    <w:p/>
+    <w:p>
+      <w:r>
+        <w:t>&lt;div class="container"&gt;</w:t>
+      </w:r>
+    </w:p>
+    <w:p>
+      <w:r>
+        <w:t>  &lt;h2&gt;Grade Calculator&lt;/h2&gt;</w:t>
+      </w:r>
+    </w:p>
+    <w:p/>
+    <w:p>
+      <w:r>
+        <w:t>  &lt;div class="form-row"&gt;</w:t>
+      </w:r>
+    </w:p>
+    <w:p>
+      <w:r>
+        <w:t>    &lt;label&gt;Student Name&lt;/label&gt;</w:t>
+      </w:r>
+    </w:p>
+    <w:p>
+      <w:r>
+        <w:t>    &lt;input id="student-name" type="text"&gt;</w:t>
+      </w:r>
+    </w:p>
+    <w:p>
+      <w:r>
+        <w:t>  &lt;/div&gt;</w:t>
+      </w:r>
+    </w:p>
+    <w:p/>
+    <w:p>
+      <w:r>
+        <w:t>  &lt;div class="form-row"&gt;</w:t>
+      </w:r>
+    </w:p>
+    <w:p>
+      <w:r>
+        <w:t>    &lt;label&gt;Subject&lt;/label&gt;</w:t>
+      </w:r>
+    </w:p>
+    <w:p>
+      <w:r>
+        <w:t>    &lt;input id="subject-name" type="text"&gt;</w:t>
+      </w:r>
+    </w:p>
+    <w:p>
+      <w:r>
+        <w:t>  &lt;/div&gt;</w:t>
+      </w:r>
+    </w:p>
+    <w:p/>
+    <w:p>
+      <w:r>
+        <w:t>  &lt;div class="form-row"&gt;</w:t>
+      </w:r>
+    </w:p>
+    <w:p>
+      <w:r>
+        <w:t>    &lt;label&gt;Midterm (0-</w:t>
+      </w:r>
+      <w:proofErr w:type="gramStart"/>
+      <w:r>
+        <w:t>100)&lt;</w:t>
+      </w:r>
+      <w:proofErr w:type="gramEnd"/>
+      <w:r>
+        <w:t>/label&gt;</w:t>
+      </w:r>
+    </w:p>
+    <w:p>
+      <w:r>
+        <w:t>    &lt;input id="midterm-score" type="int"&gt;</w:t>
+      </w:r>
+    </w:p>
+    <w:p>
+      <w:r>
+        <w:t>  &lt;/div&gt;</w:t>
+      </w:r>
+    </w:p>
+    <w:p/>
+    <w:p>
+      <w:r>
+        <w:t>  &lt;div class="form-row"&gt;</w:t>
+      </w:r>
+    </w:p>
+    <w:p>
+      <w:r>
+        <w:t>    &lt;label&gt;Final (0-</w:t>
+      </w:r>
+      <w:proofErr w:type="gramStart"/>
+      <w:r>
+        <w:t>100)&lt;</w:t>
+      </w:r>
+      <w:proofErr w:type="gramEnd"/>
+      <w:r>
+        <w:t>/label&gt;</w:t>
+      </w:r>
+    </w:p>
+    <w:p>
+      <w:r>
+        <w:t>    &lt;input id="final-score" type="int"&gt;</w:t>
+      </w:r>
+    </w:p>
+    <w:p>
+      <w:r>
+        <w:t>  &lt;/div&gt;</w:t>
+      </w:r>
+    </w:p>
+    <w:p/>
+    <w:p>
+      <w:r>
+        <w:t>  &lt;div class="form-row"&gt;</w:t>
+      </w:r>
+    </w:p>
+    <w:p>
+      <w:r>
+        <w:t>    &lt;label&gt;Assignment (0-</w:t>
+      </w:r>
+      <w:proofErr w:type="gramStart"/>
+      <w:r>
+        <w:t>100)&lt;</w:t>
+      </w:r>
+      <w:proofErr w:type="gramEnd"/>
+      <w:r>
+        <w:t>/label&gt;</w:t>
+      </w:r>
+    </w:p>
+    <w:p>
+      <w:r>
+        <w:t>    &lt;input id="assignment-score" type="int"&gt;</w:t>
+      </w:r>
+    </w:p>
+    <w:p>
+      <w:r>
+        <w:t>  &lt;/div&gt;</w:t>
+      </w:r>
+    </w:p>
+    <w:p/>
+    <w:p>
+      <w:r>
+        <w:t>  &lt;div class="button-group"&gt;</w:t>
+      </w:r>
+    </w:p>
+    <w:p>
+      <w:r>
+        <w:t>    &lt;button id="</w:t>
+      </w:r>
+      <w:proofErr w:type="spellStart"/>
+      <w:r>
+        <w:t>btn</w:t>
+      </w:r>
+      <w:proofErr w:type="spellEnd"/>
+      <w:r>
+        <w:t>-calculate"&gt;Calculate Grade&lt;/button&gt;</w:t>
+      </w:r>
+    </w:p>
+    <w:p>
+      <w:r>
+        <w:t>    &lt;button id="</w:t>
+      </w:r>
+      <w:proofErr w:type="spellStart"/>
+      <w:r>
+        <w:t>btn</w:t>
+      </w:r>
+      <w:proofErr w:type="spellEnd"/>
+      <w:r>
+        <w:t>-clear"&gt;Clear&lt;/button&gt;</w:t>
+      </w:r>
+    </w:p>
+    <w:p>
+      <w:r>
+        <w:t>  &lt;/div&gt;</w:t>
+      </w:r>
+    </w:p>
+    <w:p/>
+    <w:p>
+      <w:r>
+        <w:t>  &lt;div id="result-container" style="display: none;"&gt;</w:t>
+      </w:r>
+    </w:p>
+    <w:p>
+      <w:r>
+        <w:t>  &lt;h3&gt;Result History&lt;/h3&gt;</w:t>
+      </w:r>
+    </w:p>
+    <w:p>
+      <w:r>
+        <w:t>  &lt;div id="result-list"&gt;&lt;/div&gt;</w:t>
+      </w:r>
+    </w:p>
+    <w:p>
+      <w:r>
+        <w:t>&lt;/div&gt;</w:t>
+      </w:r>
+    </w:p>
+    <w:p/>
+    <w:p>
+      <w:r>
+        <w:lastRenderedPageBreak/>
+        <w:t>&lt;/div&gt;</w:t>
+      </w:r>
+    </w:p>
+    <w:p/>
+    <w:p>
+      <w:r>
+        <w:t>&lt;script&gt;</w:t>
+      </w:r>
+    </w:p>
+    <w:p/>
+    <w:p>
+      <w:r>
+        <w:t xml:space="preserve">    </w:t>
+      </w:r>
+    </w:p>
+    <w:p>
+      <w:r>
+        <w:t>&lt;/script&gt;</w:t>
+      </w:r>
+    </w:p>
+    <w:p/>
+    <w:p>
+      <w:r>
+        <w:t>&lt;/body&gt;</w:t>
+      </w:r>
+    </w:p>
+    <w:p>
+      <w:r>
+        <w:t>&lt;/html&gt;</w:t>
+      </w:r>
+    </w:p>
+    <w:p/>
+    <w:p>
+      <w:r>
+        <w:t>2.1</w:t>
+      </w:r>
+      <w:r>
+        <w:t xml:space="preserve">function </w:t>
+      </w:r>
+      <w:proofErr w:type="spellStart"/>
+      <w:r>
+        <w:t>validateScore</w:t>
+      </w:r>
+      <w:proofErr w:type="spellEnd"/>
+      <w:r>
+        <w:t>(score) {</w:t>
+      </w:r>
+    </w:p>
+    <w:p>
+      <w:r>
+        <w:t xml:space="preserve">  </w:t>
+      </w:r>
+    </w:p>
+    <w:p>
+      <w:r>
+        <w:t>  if (score === "" || score === null || score === undefined) {</w:t>
+      </w:r>
+    </w:p>
+    <w:p>
+      <w:r>
+        <w:t>    return false;</w:t>
+      </w:r>
+    </w:p>
+    <w:p>
+      <w:r>
+        <w:t>  }</w:t>
+      </w:r>
+    </w:p>
+    <w:p/>
+    <w:p>
+      <w:r>
+        <w:t xml:space="preserve">  const </w:t>
+      </w:r>
+      <w:proofErr w:type="spellStart"/>
+      <w:r>
+        <w:t>numberScore</w:t>
+      </w:r>
+      <w:proofErr w:type="spellEnd"/>
+      <w:r>
+        <w:t xml:space="preserve"> = Number(score);</w:t>
+      </w:r>
+    </w:p>
+    <w:p/>
+    <w:p>
+      <w:r>
+        <w:t>  if (</w:t>
+      </w:r>
+      <w:proofErr w:type="spellStart"/>
+      <w:r>
+        <w:t>isNaN</w:t>
+      </w:r>
+      <w:proofErr w:type="spellEnd"/>
+      <w:r>
+        <w:t>(</w:t>
+      </w:r>
+      <w:proofErr w:type="spellStart"/>
+      <w:r>
+        <w:t>numberScore</w:t>
+      </w:r>
+      <w:proofErr w:type="spellEnd"/>
+      <w:r>
+        <w:t>)) {</w:t>
+      </w:r>
+    </w:p>
+    <w:p>
+      <w:r>
+        <w:t>    return false;</w:t>
+      </w:r>
+    </w:p>
+    <w:p>
+      <w:r>
+        <w:t>  }</w:t>
+      </w:r>
+    </w:p>
+    <w:p/>
+    <w:p>
+      <w:r>
+        <w:t>  if (</w:t>
+      </w:r>
+      <w:proofErr w:type="spellStart"/>
+      <w:r>
+        <w:t>numberScore</w:t>
+      </w:r>
+      <w:proofErr w:type="spellEnd"/>
+      <w:r>
+        <w:t xml:space="preserve"> &lt; 0 || </w:t>
+      </w:r>
+      <w:proofErr w:type="spellStart"/>
+      <w:r>
+        <w:t>numberScore</w:t>
+      </w:r>
+      <w:proofErr w:type="spellEnd"/>
+      <w:r>
+        <w:t xml:space="preserve"> &gt; 100) {</w:t>
+      </w:r>
+    </w:p>
+    <w:p>
+      <w:r>
+        <w:t>    return false;</w:t>
+      </w:r>
+    </w:p>
+    <w:p>
+      <w:r>
+        <w:t>  }</w:t>
+      </w:r>
+    </w:p>
+    <w:p/>
+    <w:p>
+      <w:r>
+        <w:t>  return true;</w:t>
+      </w:r>
+    </w:p>
+    <w:p>
+      <w:r>
+        <w:t>}</w:t>
+      </w:r>
+    </w:p>
+    <w:p>
+      <w:proofErr w:type="gramStart"/>
+      <w:r>
+        <w:t>document.getElementById</w:t>
+      </w:r>
+      <w:proofErr w:type="gramEnd"/>
+      <w:r>
+        <w:t>("btn-calculate").addEventListener("click", function () {</w:t>
+      </w:r>
+    </w:p>
+    <w:p/>
+    <w:p>
+      <w:r>
+        <w:t xml:space="preserve">  const midterm = </w:t>
+      </w:r>
+      <w:proofErr w:type="spellStart"/>
+      <w:proofErr w:type="gramStart"/>
+      <w:r>
+        <w:t>document.getElementById</w:t>
+      </w:r>
+      <w:proofErr w:type="spellEnd"/>
+      <w:proofErr w:type="gramEnd"/>
+      <w:r>
+        <w:t>("midterm-score").value;</w:t>
+      </w:r>
+    </w:p>
+    <w:p>
+      <w:r>
+        <w:lastRenderedPageBreak/>
+        <w:t xml:space="preserve">  const </w:t>
+      </w:r>
+      <w:proofErr w:type="spellStart"/>
+      <w:r>
+        <w:t>finalScore</w:t>
+      </w:r>
+      <w:proofErr w:type="spellEnd"/>
+      <w:r>
+        <w:t xml:space="preserve"> = </w:t>
+      </w:r>
+      <w:proofErr w:type="spellStart"/>
+      <w:proofErr w:type="gramStart"/>
+      <w:r>
+        <w:t>document.getElementById</w:t>
+      </w:r>
+      <w:proofErr w:type="spellEnd"/>
+      <w:proofErr w:type="gramEnd"/>
+      <w:r>
+        <w:t>("final-score").value;</w:t>
+      </w:r>
+    </w:p>
+    <w:p>
+      <w:r>
+        <w:t xml:space="preserve">  const assignment = </w:t>
+      </w:r>
+      <w:proofErr w:type="spellStart"/>
+      <w:proofErr w:type="gramStart"/>
+      <w:r>
+        <w:t>document.getElementById</w:t>
+      </w:r>
+      <w:proofErr w:type="spellEnd"/>
+      <w:proofErr w:type="gramEnd"/>
+      <w:r>
+        <w:t>("assignment-score").value;</w:t>
+      </w:r>
+    </w:p>
+    <w:p/>
+    <w:p>
+      <w:r>
+        <w:t>  if (</w:t>
+      </w:r>
+    </w:p>
+    <w:p>
+      <w:r>
+        <w:t xml:space="preserve">    </w:t>
+      </w:r>
+      <w:proofErr w:type="gramStart"/>
+      <w:r>
+        <w:t>!</w:t>
+      </w:r>
+      <w:proofErr w:type="spellStart"/>
+      <w:r>
+        <w:t>validateScore</w:t>
+      </w:r>
+      <w:proofErr w:type="spellEnd"/>
+      <w:proofErr w:type="gramEnd"/>
+      <w:r>
+        <w:t>(midterm) ||</w:t>
+      </w:r>
+    </w:p>
+    <w:p>
+      <w:r>
+        <w:t xml:space="preserve">    </w:t>
+      </w:r>
+      <w:proofErr w:type="gramStart"/>
+      <w:r>
+        <w:t>!</w:t>
+      </w:r>
+      <w:proofErr w:type="spellStart"/>
+      <w:r>
+        <w:t>validateScore</w:t>
+      </w:r>
+      <w:proofErr w:type="spellEnd"/>
+      <w:proofErr w:type="gramEnd"/>
+      <w:r>
+        <w:t>(</w:t>
+      </w:r>
+      <w:proofErr w:type="spellStart"/>
+      <w:r>
+        <w:t>finalScore</w:t>
+      </w:r>
+      <w:proofErr w:type="spellEnd"/>
+      <w:r>
+        <w:t>) ||</w:t>
+      </w:r>
+    </w:p>
+    <w:p>
+      <w:r>
+        <w:t xml:space="preserve">    </w:t>
+      </w:r>
+      <w:proofErr w:type="gramStart"/>
+      <w:r>
+        <w:t>!</w:t>
+      </w:r>
+      <w:proofErr w:type="spellStart"/>
+      <w:r>
+        <w:t>validateScore</w:t>
+      </w:r>
+      <w:proofErr w:type="spellEnd"/>
+      <w:proofErr w:type="gramEnd"/>
+      <w:r>
+        <w:t>(assignment)</w:t>
+      </w:r>
+    </w:p>
+    <w:p>
+      <w:r>
+        <w:t>  ) {</w:t>
+      </w:r>
+    </w:p>
+    <w:p>
+      <w:r>
+        <w:t>    alert("</w:t>
+      </w:r>
+      <w:r>
+        <w:rPr>
+          <w:cs/>
+        </w:rPr>
+        <w:t>กรุณากรอกคะแนนให้ถูกต้อง"</w:t>
+      </w:r>
+      <w:r>
+        <w:t>);</w:t>
+      </w:r>
+    </w:p>
+    <w:p>
+      <w:r>
+        <w:t xml:space="preserve">    return; // </w:t>
+      </w:r>
+      <w:r>
+        <w:rPr>
+          <w:rFonts w:ascii="Segoe UI Emoji" w:hAnsi="Segoe UI Emoji" w:cs="Segoe UI Emoji"/>
+        </w:rPr>
+        <w:t>✅</w:t>
+      </w:r>
+      <w:r>
+        <w:t xml:space="preserve"> </w:t>
+      </w:r>
+      <w:r>
+        <w:rPr>
+          <w:cs/>
+        </w:rPr>
+        <w:t>ใช้ได้</w:t>
+      </w:r>
+    </w:p>
+    <w:p>
+      <w:r>
+        <w:t>  }</w:t>
+      </w:r>
+    </w:p>
+    <w:p/>
+    <w:p>
+      <w:r>
+        <w:t>  alert("</w:t>
+      </w:r>
+      <w:r>
+        <w:rPr>
+          <w:cs/>
+        </w:rPr>
+        <w:t>ข้อมูลถูกต้อง"</w:t>
+      </w:r>
+      <w:r>
+        <w:t>);</w:t>
+      </w:r>
+    </w:p>
+    <w:p>
+      <w:r>
+        <w:t>});</w:t>
+      </w:r>
+    </w:p>
+    <w:p>
+      <w:r>
+        <w:drawing>
+          <wp:inline distT="0" distB="0" distL="0" distR="0" wp14:anchorId="23B7B56B" wp14:editId="51DD4425">
+            <wp:extent cx="5731510" cy="3147695"/>
+            <wp:effectExtent l="0" t="0" r="2540" b="0"/>
+            <wp:docPr id="2" name="Picture 2"/>
+            <wp:cNvGraphicFramePr>
+              <a:graphicFrameLocks xmlns:a="http://schemas.openxmlformats.org/drawingml/2006/main" noChangeAspect="1"/>
+            </wp:cNvGraphicFramePr>
+            <a:graphic xmlns:a="http://schemas.openxmlformats.org/drawingml/2006/main">
+              <a:graphicData uri="http://schemas.openxmlformats.org/drawingml/2006/picture">
+                <pic:pic xmlns:pic="http://schemas.openxmlformats.org/drawingml/2006/picture">
+                  <pic:nvPicPr>
+                    <pic:cNvPr id="1" name=""/>
+                    <pic:cNvPicPr/>
+                  </pic:nvPicPr>
+                  <pic:blipFill>
+                    <a:blip r:embed="rId7"/>
+                    <a:stretch>
+                      <a:fillRect/>
+                    </a:stretch>
+                  </pic:blipFill>
+                  <pic:spPr>
+                    <a:xfrm>
+                      <a:off x="0" y="0"/>
+                      <a:ext cx="5731510" cy="3147695"/>
+                    </a:xfrm>
+                    <a:prstGeom prst="rect">
+                      <a:avLst/>
+                    </a:prstGeom>
+                  </pic:spPr>
+                </pic:pic>
+              </a:graphicData>
+            </a:graphic>
+          </wp:inline>
+        </w:drawing>
+      </w:r>
+    </w:p>
+    <w:p/>
+    <w:p>
+      <w:r>
+        <w:t>2.2</w:t>
+      </w:r>
+    </w:p>
+    <w:p>
+      <w:r>
+        <w:t xml:space="preserve">function </w:t>
+      </w:r>
+      <w:proofErr w:type="spellStart"/>
+      <w:proofErr w:type="gramStart"/>
+      <w:r>
+        <w:t>calculateScore</w:t>
+      </w:r>
+      <w:proofErr w:type="spellEnd"/>
+      <w:r>
+        <w:t>(</w:t>
+      </w:r>
+      <w:proofErr w:type="gramEnd"/>
+      <w:r>
+        <w:t xml:space="preserve">midterm, </w:t>
+      </w:r>
+      <w:proofErr w:type="spellStart"/>
+      <w:r>
+        <w:t>finalScore</w:t>
+      </w:r>
+      <w:proofErr w:type="spellEnd"/>
+      <w:r>
+        <w:t>, assignment) {</w:t>
+      </w:r>
+    </w:p>
+    <w:p>
+      <w:r>
+        <w:t>  return (midterm * 0.2) + (</w:t>
+      </w:r>
+      <w:proofErr w:type="spellStart"/>
+      <w:r>
+        <w:t>finalScore</w:t>
+      </w:r>
+      <w:proofErr w:type="spellEnd"/>
+      <w:r>
+        <w:t xml:space="preserve"> * 0.5) + (assignment * 0.3);</w:t>
+      </w:r>
+    </w:p>
+    <w:p>
+      <w:r>
+        <w:t>}</w:t>
+      </w:r>
+    </w:p>
+    <w:p>
+      <w:r>
+        <w:lastRenderedPageBreak/>
+        <w:t xml:space="preserve">const </w:t>
+      </w:r>
+      <w:proofErr w:type="spellStart"/>
+      <w:r>
+        <w:t>totalScore</w:t>
+      </w:r>
+      <w:proofErr w:type="spellEnd"/>
+      <w:r>
+        <w:t xml:space="preserve"> = </w:t>
+      </w:r>
+      <w:proofErr w:type="spellStart"/>
+      <w:proofErr w:type="gramStart"/>
+      <w:r>
+        <w:t>calculateScore</w:t>
+      </w:r>
+      <w:proofErr w:type="spellEnd"/>
+      <w:r>
+        <w:t>(</w:t>
+      </w:r>
+      <w:proofErr w:type="gramEnd"/>
+    </w:p>
+    <w:p>
+      <w:r>
+        <w:t>      Number(midterm),</w:t>
+      </w:r>
+    </w:p>
+    <w:p>
+      <w:r>
+        <w:t>      Number(</w:t>
+      </w:r>
+      <w:proofErr w:type="spellStart"/>
+      <w:r>
+        <w:t>finalScore</w:t>
+      </w:r>
+      <w:proofErr w:type="spellEnd"/>
+      <w:r>
+        <w:t>),</w:t>
+      </w:r>
+    </w:p>
+    <w:p>
+      <w:r>
+        <w:t>      Number(assignment)</w:t>
+      </w:r>
+    </w:p>
+    <w:p>
+      <w:r>
+        <w:t>    );</w:t>
+      </w:r>
+    </w:p>
+    <w:p/>
+    <w:p>
+      <w:r>
+        <w:t xml:space="preserve">    </w:t>
+      </w:r>
+      <w:proofErr w:type="gramStart"/>
+      <w:r>
+        <w:t>console.log(</w:t>
+      </w:r>
+      <w:proofErr w:type="gramEnd"/>
+      <w:r>
+        <w:t xml:space="preserve">"Total Score:", </w:t>
+      </w:r>
+      <w:proofErr w:type="spellStart"/>
+      <w:r>
+        <w:t>totalScore</w:t>
+      </w:r>
+      <w:proofErr w:type="spellEnd"/>
+      <w:r>
+        <w:t>);</w:t>
+      </w:r>
+    </w:p>
+    <w:p>
+      <w:r>
+        <w:t xml:space="preserve">    </w:t>
+      </w:r>
+      <w:proofErr w:type="gramStart"/>
+      <w:r>
+        <w:t>alert(</w:t>
+      </w:r>
+      <w:proofErr w:type="gramEnd"/>
+      <w:r>
+        <w:t>"</w:t>
+      </w:r>
+      <w:r>
+        <w:rPr>
+          <w:cs/>
+        </w:rPr>
+        <w:t>คะแนนรวม = "</w:t>
+      </w:r>
+      <w:r>
+        <w:t xml:space="preserve"> + </w:t>
+      </w:r>
+      <w:proofErr w:type="spellStart"/>
+      <w:r>
+        <w:t>totalScore</w:t>
+      </w:r>
+      <w:proofErr w:type="spellEnd"/>
+      <w:r>
+        <w:t>);</w:t>
+      </w:r>
+    </w:p>
+    <w:p>
+      <w:r>
+        <w:drawing>
+          <wp:inline distT="0" distB="0" distL="0" distR="0" wp14:anchorId="30F1874A" wp14:editId="5527A1FE">
+            <wp:extent cx="5731510" cy="3060065"/>
+            <wp:effectExtent l="0" t="0" r="2540" b="6985"/>
+            <wp:docPr id="3" name="Picture 3"/>
+            <wp:cNvGraphicFramePr>
+              <a:graphicFrameLocks xmlns:a="http://schemas.openxmlformats.org/drawingml/2006/main" noChangeAspect="1"/>
+            </wp:cNvGraphicFramePr>
+            <a:graphic xmlns:a="http://schemas.openxmlformats.org/drawingml/2006/main">
+              <a:graphicData uri="http://schemas.openxmlformats.org/drawingml/2006/picture">
+                <pic:pic xmlns:pic="http://schemas.openxmlformats.org/drawingml/2006/picture">
+                  <pic:nvPicPr>
+                    <pic:cNvPr id="1" name=""/>
+                    <pic:cNvPicPr/>
+                  </pic:nvPicPr>
+                  <pic:blipFill>
+                    <a:blip r:embed="rId8"/>
+                    <a:stretch>
+                      <a:fillRect/>
+                    </a:stretch>
+                  </pic:blipFill>
+                  <pic:spPr>
+                    <a:xfrm>
+                      <a:off x="0" y="0"/>
+                      <a:ext cx="5731510" cy="3060065"/>
+                    </a:xfrm>
+                    <a:prstGeom prst="rect">
+                      <a:avLst/>
+                    </a:prstGeom>
+                  </pic:spPr>
+                </pic:pic>
+              </a:graphicData>
+            </a:graphic>
+          </wp:inline>
+        </w:drawing>
+      </w:r>
+    </w:p>
+    <w:p>
+      <w:r>
+        <w:t>2.3</w:t>
+      </w:r>
+      <w:r>
+        <w:t xml:space="preserve">function </w:t>
+      </w:r>
+      <w:proofErr w:type="spellStart"/>
+      <w:r>
+        <w:t>getGrade</w:t>
+      </w:r>
+      <w:proofErr w:type="spellEnd"/>
+      <w:r>
+        <w:t>(score) {</w:t>
+      </w:r>
+    </w:p>
+    <w:p>
+      <w:r>
+        <w:t>  if (score &gt;= 80 &amp;&amp; score &lt;= 100) {</w:t>
+      </w:r>
+    </w:p>
+    <w:p>
+      <w:r>
+        <w:t>    return "A";</w:t>
+      </w:r>
+    </w:p>
+    <w:p>
+      <w:r>
+        <w:t>  } else if (score &gt;= 70) {</w:t>
+      </w:r>
+    </w:p>
+    <w:p>
+      <w:r>
+        <w:t>    return "B";</w:t>
+      </w:r>
+    </w:p>
+    <w:p>
+      <w:r>
+        <w:t>  } else if (score &gt;= 60) {</w:t>
+      </w:r>
+    </w:p>
+    <w:p>
+      <w:r>
+        <w:t>    return "C";</w:t>
+      </w:r>
+    </w:p>
+    <w:p>
+      <w:r>
+        <w:t>  } else if (score &gt;= 50) {</w:t>
+      </w:r>
+    </w:p>
+    <w:p>
+      <w:r>
+        <w:t>    return "D";</w:t>
+      </w:r>
+    </w:p>
+    <w:p>
+      <w:r>
+        <w:t>  } else {</w:t>
+      </w:r>
+    </w:p>
+    <w:p>
+      <w:r>
+        <w:t>    return "F";</w:t>
+      </w:r>
+    </w:p>
+    <w:p>
+      <w:r>
+        <w:t>  }</w:t>
+      </w:r>
+    </w:p>
+    <w:p>
+      <w:r>
+        <w:lastRenderedPageBreak/>
+        <w:t>}</w:t>
+      </w:r>
+    </w:p>
+    <w:p/>
+    <w:p/>
+    <w:p>
+      <w:r>
+        <w:drawing>
+          <wp:inline distT="0" distB="0" distL="0" distR="0" wp14:anchorId="6952EE13" wp14:editId="72B8EE71">
+            <wp:extent cx="5731510" cy="2988310"/>
+            <wp:effectExtent l="0" t="0" r="2540" b="2540"/>
+            <wp:docPr id="4" name="Picture 4"/>
+            <wp:cNvGraphicFramePr>
+              <a:graphicFrameLocks xmlns:a="http://schemas.openxmlformats.org/drawingml/2006/main" noChangeAspect="1"/>
+            </wp:cNvGraphicFramePr>
+            <a:graphic xmlns:a="http://schemas.openxmlformats.org/drawingml/2006/main">
+              <a:graphicData uri="http://schemas.openxmlformats.org/drawingml/2006/picture">
+                <pic:pic xmlns:pic="http://schemas.openxmlformats.org/drawingml/2006/picture">
+                  <pic:nvPicPr>
+                    <pic:cNvPr id="1" name=""/>
+                    <pic:cNvPicPr/>
+                  </pic:nvPicPr>
+                  <pic:blipFill>
+                    <a:blip r:embed="rId9"/>
+                    <a:stretch>
+                      <a:fillRect/>
+                    </a:stretch>
+                  </pic:blipFill>
+                  <pic:spPr>
+                    <a:xfrm>
+                      <a:off x="0" y="0"/>
+                      <a:ext cx="5731510" cy="2988310"/>
+                    </a:xfrm>
+                    <a:prstGeom prst="rect">
+                      <a:avLst/>
+                    </a:prstGeom>
+                  </pic:spPr>
+                </pic:pic>
+              </a:graphicData>
+            </a:graphic>
+          </wp:inline>
+        </w:drawing>
+      </w:r>
+    </w:p>
+    <w:p/>
+    <w:p>
+      <w:r>
+        <w:rPr>
+          <w:rFonts w:hint="cs"/>
+          <w:cs/>
+        </w:rPr>
+        <w:t>2.4</w:t>
+      </w:r>
+    </w:p>
+    <w:p>
+      <w:r>
+        <w:t xml:space="preserve">function </w:t>
+      </w:r>
+      <w:proofErr w:type="spellStart"/>
+      <w:r>
+        <w:t>getStatus</w:t>
+      </w:r>
+      <w:proofErr w:type="spellEnd"/>
+      <w:r>
+        <w:t>(grade) {</w:t>
+      </w:r>
+    </w:p>
+    <w:p>
+      <w:r>
+        <w:t>  if (grade === "F") {</w:t>
+      </w:r>
+    </w:p>
+    <w:p>
+      <w:r>
+        <w:t>    return "FAIL";</w:t>
+      </w:r>
+    </w:p>
+    <w:p>
+      <w:r>
+        <w:t>  } else {</w:t>
+      </w:r>
+    </w:p>
+    <w:p>
+      <w:r>
+        <w:t>    return "PASS";</w:t>
+      </w:r>
+    </w:p>
+    <w:p>
+      <w:r>
+        <w:t>  }</w:t>
+      </w:r>
+    </w:p>
+    <w:p>
+      <w:r>
+        <w:t>}</w:t>
+      </w:r>
+    </w:p>
+    <w:p/>
+    <w:p>
+      <w:r>
+        <w:lastRenderedPageBreak/>
+        <w:drawing>
+          <wp:inline distT="0" distB="0" distL="0" distR="0" wp14:anchorId="39F0D242" wp14:editId="13FC7EED">
+            <wp:extent cx="5731510" cy="3048635"/>
+            <wp:effectExtent l="0" t="0" r="2540" b="0"/>
+            <wp:docPr id="5" name="Picture 5"/>
+            <wp:cNvGraphicFramePr>
+              <a:graphicFrameLocks xmlns:a="http://schemas.openxmlformats.org/drawingml/2006/main" noChangeAspect="1"/>
+            </wp:cNvGraphicFramePr>
+            <a:graphic xmlns:a="http://schemas.openxmlformats.org/drawingml/2006/main">
+              <a:graphicData uri="http://schemas.openxmlformats.org/drawingml/2006/picture">
+                <pic:pic xmlns:pic="http://schemas.openxmlformats.org/drawingml/2006/picture">
+                  <pic:nvPicPr>
+                    <pic:cNvPr id="1" name=""/>
+                    <pic:cNvPicPr/>
+                  </pic:nvPicPr>
+                  <pic:blipFill>
+                    <a:blip r:embed="rId10"/>
+                    <a:stretch>
+                      <a:fillRect/>
+                    </a:stretch>
+                  </pic:blipFill>
+                  <pic:spPr>
+                    <a:xfrm>
+                      <a:off x="0" y="0"/>
+                      <a:ext cx="5731510" cy="3048635"/>
+                    </a:xfrm>
+                    <a:prstGeom prst="rect">
+                      <a:avLst/>
+                    </a:prstGeom>
+                  </pic:spPr>
+                </pic:pic>
+              </a:graphicData>
+            </a:graphic>
+          </wp:inline>
+        </w:drawing>
+      </w:r>
+    </w:p>
+    <w:p/>
+    <w:p>
+      <w:r>
+        <w:t>2.5</w:t>
+      </w:r>
+    </w:p>
+    <w:p>
+      <w:r>
+        <w:t xml:space="preserve">function </w:t>
+      </w:r>
+      <w:proofErr w:type="spellStart"/>
+      <w:r>
+        <w:t>saveToStorage</w:t>
+      </w:r>
+      <w:proofErr w:type="spellEnd"/>
+      <w:r>
+        <w:t>(data) {</w:t>
+      </w:r>
+    </w:p>
+    <w:p>
+      <w:r>
+        <w:t xml:space="preserve">  let </w:t>
+      </w:r>
+      <w:proofErr w:type="spellStart"/>
+      <w:r>
+        <w:t>storedData</w:t>
+      </w:r>
+      <w:proofErr w:type="spellEnd"/>
+      <w:r>
+        <w:t xml:space="preserve"> = </w:t>
+      </w:r>
+      <w:proofErr w:type="spellStart"/>
+      <w:r>
+        <w:t>localStorage.getItem</w:t>
+      </w:r>
+      <w:proofErr w:type="spellEnd"/>
+      <w:r>
+        <w:t>("</w:t>
+      </w:r>
+      <w:proofErr w:type="spellStart"/>
+      <w:r>
+        <w:t>studentData</w:t>
+      </w:r>
+      <w:proofErr w:type="spellEnd"/>
+      <w:r>
+        <w:t>");</w:t>
+      </w:r>
+    </w:p>
+    <w:p>
+      <w:r>
+        <w:t xml:space="preserve">  let </w:t>
+      </w:r>
+      <w:proofErr w:type="spellStart"/>
+      <w:r>
+        <w:t>dataArray</w:t>
+      </w:r>
+      <w:proofErr w:type="spellEnd"/>
+      <w:r>
+        <w:t xml:space="preserve"> = </w:t>
+      </w:r>
+      <w:proofErr w:type="spellStart"/>
+      <w:proofErr w:type="gramStart"/>
+      <w:r>
+        <w:t>storedData</w:t>
+      </w:r>
+      <w:proofErr w:type="spellEnd"/>
+      <w:r>
+        <w:t xml:space="preserve"> ?</w:t>
+      </w:r>
+      <w:proofErr w:type="gramEnd"/>
+      <w:r>
+        <w:t xml:space="preserve"> </w:t>
+      </w:r>
+      <w:proofErr w:type="spellStart"/>
+      <w:r>
+        <w:t>JSON.parse</w:t>
+      </w:r>
+      <w:proofErr w:type="spellEnd"/>
+      <w:r>
+        <w:t>(</w:t>
+      </w:r>
+      <w:proofErr w:type="spellStart"/>
+      <w:r>
+        <w:t>storedData</w:t>
+      </w:r>
+      <w:proofErr w:type="spellEnd"/>
+      <w:proofErr w:type="gramStart"/>
+      <w:r>
+        <w:t>) :</w:t>
+      </w:r>
+      <w:proofErr w:type="gramEnd"/>
+      <w:r>
+        <w:t xml:space="preserve"> [];</w:t>
+      </w:r>
+    </w:p>
+    <w:p>
+      <w:r>
+        <w:t xml:space="preserve">  </w:t>
+      </w:r>
+      <w:proofErr w:type="spellStart"/>
+      <w:r>
+        <w:t>dataArray.push</w:t>
+      </w:r>
+      <w:proofErr w:type="spellEnd"/>
+      <w:r>
+        <w:t>(data);</w:t>
+      </w:r>
+    </w:p>
+    <w:p>
+      <w:r>
+        <w:t xml:space="preserve">  </w:t>
+      </w:r>
+      <w:proofErr w:type="spellStart"/>
+      <w:r>
+        <w:t>localStorage.setItem</w:t>
+      </w:r>
+      <w:proofErr w:type="spellEnd"/>
+      <w:r>
+        <w:t>("</w:t>
+      </w:r>
+      <w:proofErr w:type="spellStart"/>
+      <w:r>
+        <w:t>studentData</w:t>
+      </w:r>
+      <w:proofErr w:type="spellEnd"/>
+      <w:r>
+        <w:t xml:space="preserve">", </w:t>
+      </w:r>
+      <w:proofErr w:type="spellStart"/>
+      <w:r>
+        <w:t>JSON.stringify</w:t>
+      </w:r>
+      <w:proofErr w:type="spellEnd"/>
+      <w:r>
+        <w:t>(</w:t>
+      </w:r>
+      <w:proofErr w:type="spellStart"/>
+      <w:r>
+        <w:t>dataArray</w:t>
+      </w:r>
+      <w:proofErr w:type="spellEnd"/>
+      <w:r>
+        <w:t>));</w:t>
+      </w:r>
+    </w:p>
+    <w:p>
+      <w:r>
+        <w:t>}</w:t>
+      </w:r>
+    </w:p>
+    <w:p/>
+    <w:p/>
+    <w:p>
+      <w:r>
+        <w:rPr>
+          <w:rFonts w:cs="Cordia New"/>
+          <w:cs/>
+        </w:rPr>
+        <w:lastRenderedPageBreak/>
+        <w:drawing>
+          <wp:inline distT="0" distB="0" distL="0" distR="0" wp14:anchorId="48F18505" wp14:editId="7D2CE1BD">
+            <wp:extent cx="4379900" cy="4389120"/>
+            <wp:effectExtent l="0" t="0" r="1905" b="0"/>
+            <wp:docPr id="6" name="Picture 6"/>
+            <wp:cNvGraphicFramePr>
+              <a:graphicFrameLocks xmlns:a="http://schemas.openxmlformats.org/drawingml/2006/main" noChangeAspect="1"/>
+            </wp:cNvGraphicFramePr>
+            <a:graphic xmlns:a="http://schemas.openxmlformats.org/drawingml/2006/main">
+              <a:graphicData uri="http://schemas.openxmlformats.org/drawingml/2006/picture">
+                <pic:pic xmlns:pic="http://schemas.openxmlformats.org/drawingml/2006/picture">
+                  <pic:nvPicPr>
+                    <pic:cNvPr id="1" name=""/>
+                    <pic:cNvPicPr/>
+                  </pic:nvPicPr>
+                  <pic:blipFill>
+                    <a:blip r:embed="rId11"/>
+                    <a:stretch>
+                      <a:fillRect/>
+                    </a:stretch>
+                  </pic:blipFill>
+                  <pic:spPr>
+                    <a:xfrm>
+                      <a:off x="0" y="0"/>
+                      <a:ext cx="4381587" cy="4390811"/>
+                    </a:xfrm>
+                    <a:prstGeom prst="rect">
+                      <a:avLst/>
+                    </a:prstGeom>
+                  </pic:spPr>
+                </pic:pic>
+              </a:graphicData>
+            </a:graphic>
+          </wp:inline>
+        </w:drawing>
+      </w:r>
+    </w:p>
+    <w:p>
+      <w:r>
+        <w:rPr>
+          <w:rFonts w:hint="cs"/>
+          <w:cs/>
+        </w:rPr>
+        <w:t>2.6</w:t>
+      </w:r>
+      <w:r>
+        <w:t xml:space="preserve">function </w:t>
+      </w:r>
+      <w:proofErr w:type="spellStart"/>
+      <w:r>
+        <w:t>loadFromStorage</w:t>
+      </w:r>
+      <w:proofErr w:type="spellEnd"/>
+      <w:r>
+        <w:t>() {</w:t>
+      </w:r>
+    </w:p>
+    <w:p>
+      <w:r>
+        <w:t xml:space="preserve">  const </w:t>
+      </w:r>
+      <w:proofErr w:type="spellStart"/>
+      <w:r>
+        <w:t>storedData</w:t>
+      </w:r>
+      <w:proofErr w:type="spellEnd"/>
+      <w:r>
+        <w:t xml:space="preserve"> = </w:t>
+      </w:r>
+      <w:proofErr w:type="spellStart"/>
+      <w:r>
+        <w:t>localStorage.getItem</w:t>
+      </w:r>
+      <w:proofErr w:type="spellEnd"/>
+      <w:r>
+        <w:t>("</w:t>
+      </w:r>
+      <w:proofErr w:type="spellStart"/>
+      <w:r>
+        <w:t>studentData</w:t>
+      </w:r>
+      <w:proofErr w:type="spellEnd"/>
+      <w:r>
+        <w:t>");</w:t>
+      </w:r>
+    </w:p>
+    <w:p/>
+    <w:p>
+      <w:r>
+        <w:t>  if (</w:t>
+      </w:r>
+      <w:proofErr w:type="spellStart"/>
+      <w:r>
+        <w:t>storedData</w:t>
+      </w:r>
+      <w:proofErr w:type="spellEnd"/>
+      <w:r>
+        <w:t>) {</w:t>
+      </w:r>
+    </w:p>
+    <w:p>
+      <w:r>
+        <w:t xml:space="preserve">    return </w:t>
+      </w:r>
+      <w:proofErr w:type="spellStart"/>
+      <w:r>
+        <w:t>JSON.parse</w:t>
+      </w:r>
+      <w:proofErr w:type="spellEnd"/>
+      <w:r>
+        <w:t>(</w:t>
+      </w:r>
+      <w:proofErr w:type="spellStart"/>
+      <w:r>
+        <w:t>storedData</w:t>
+      </w:r>
+      <w:proofErr w:type="spellEnd"/>
+      <w:r>
+        <w:t>);</w:t>
+      </w:r>
+    </w:p>
+    <w:p>
+      <w:r>
+        <w:t>  } else {</w:t>
+      </w:r>
+    </w:p>
+    <w:p>
+      <w:r>
+        <w:t>    return null;</w:t>
+      </w:r>
+    </w:p>
+    <w:p>
+      <w:r>
+        <w:t>  }</w:t>
+      </w:r>
+    </w:p>
+    <w:p>
+      <w:r>
+        <w:t>}</w:t>
+      </w:r>
+    </w:p>
+    <w:p>
+      <w:r>
+        <w:rPr>
+          <w:rFonts w:cs="Cordia New"/>
+          <w:cs/>
+        </w:rPr>
+        <w:lastRenderedPageBreak/>
+        <w:drawing>
+          <wp:inline distT="0" distB="0" distL="0" distR="0" wp14:anchorId="18103197" wp14:editId="1E636025">
+            <wp:extent cx="5731510" cy="3745865"/>
+            <wp:effectExtent l="0" t="0" r="2540" b="6985"/>
+            <wp:docPr id="7" name="Picture 7"/>
+            <wp:cNvGraphicFramePr>
+              <a:graphicFrameLocks xmlns:a="http://schemas.openxmlformats.org/drawingml/2006/main" noChangeAspect="1"/>
+            </wp:cNvGraphicFramePr>
+            <a:graphic xmlns:a="http://schemas.openxmlformats.org/drawingml/2006/main">
+              <a:graphicData uri="http://schemas.openxmlformats.org/drawingml/2006/picture">
+                <pic:pic xmlns:pic="http://schemas.openxmlformats.org/drawingml/2006/picture">
+                  <pic:nvPicPr>
+                    <pic:cNvPr id="1" name=""/>
+                    <pic:cNvPicPr/>
+                  </pic:nvPicPr>
+                  <pic:blipFill>
+                    <a:blip r:embed="rId12"/>
+                    <a:stretch>
+                      <a:fillRect/>
+                    </a:stretch>
+                  </pic:blipFill>
+                  <pic:spPr>
+                    <a:xfrm>
+                      <a:off x="0" y="0"/>
+                      <a:ext cx="5731510" cy="3745865"/>
+                    </a:xfrm>
+                    <a:prstGeom prst="rect">
+                      <a:avLst/>
+                    </a:prstGeom>
+                  </pic:spPr>
+                </pic:pic>
+              </a:graphicData>
+            </a:graphic>
+          </wp:inline>
+        </w:drawing>
+      </w:r>
+    </w:p>
+    <w:p>
+      <w:r>
+        <w:rPr>
+          <w:rFonts w:hint="cs"/>
+          <w:cs/>
+        </w:rPr>
+        <w:t>2.7</w:t>
+      </w:r>
+      <w:r>
+        <w:t xml:space="preserve">function </w:t>
+      </w:r>
+      <w:proofErr w:type="spellStart"/>
+      <w:r>
+        <w:t>handleCalculate</w:t>
+      </w:r>
+      <w:proofErr w:type="spellEnd"/>
+      <w:r>
+        <w:t>() {</w:t>
+      </w:r>
+    </w:p>
+    <w:p>
+      <w:r>
+        <w:t xml:space="preserve">  const name = </w:t>
+      </w:r>
+      <w:proofErr w:type="spellStart"/>
+      <w:proofErr w:type="gramStart"/>
+      <w:r>
+        <w:t>document.getElementById</w:t>
+      </w:r>
+      <w:proofErr w:type="spellEnd"/>
+      <w:proofErr w:type="gramEnd"/>
+      <w:r>
+        <w:t>("student-name").</w:t>
+      </w:r>
+      <w:proofErr w:type="spellStart"/>
+      <w:r>
+        <w:t>value.trim</w:t>
+      </w:r>
+      <w:proofErr w:type="spellEnd"/>
+      <w:r>
+        <w:t>();</w:t>
+      </w:r>
+    </w:p>
+    <w:p>
+      <w:r>
+        <w:t xml:space="preserve">  const subject = </w:t>
+      </w:r>
+      <w:proofErr w:type="spellStart"/>
+      <w:proofErr w:type="gramStart"/>
+      <w:r>
+        <w:t>document.getElementById</w:t>
+      </w:r>
+      <w:proofErr w:type="spellEnd"/>
+      <w:proofErr w:type="gramEnd"/>
+      <w:r>
+        <w:t>("subject-name").</w:t>
+      </w:r>
+      <w:proofErr w:type="spellStart"/>
+      <w:r>
+        <w:t>value.trim</w:t>
+      </w:r>
+      <w:proofErr w:type="spellEnd"/>
+      <w:r>
+        <w:t>();</w:t>
+      </w:r>
+    </w:p>
+    <w:p>
+      <w:r>
+        <w:t xml:space="preserve">  const midterm = </w:t>
+      </w:r>
+      <w:proofErr w:type="spellStart"/>
+      <w:proofErr w:type="gramStart"/>
+      <w:r>
+        <w:t>document.getElementById</w:t>
+      </w:r>
+      <w:proofErr w:type="spellEnd"/>
+      <w:proofErr w:type="gramEnd"/>
+      <w:r>
+        <w:t>("midterm-score").value;</w:t>
+      </w:r>
+    </w:p>
+    <w:p>
+      <w:r>
+        <w:t xml:space="preserve">  const </w:t>
+      </w:r>
+      <w:proofErr w:type="spellStart"/>
+      <w:r>
+        <w:t>finalScore</w:t>
+      </w:r>
+      <w:proofErr w:type="spellEnd"/>
+      <w:r>
+        <w:t xml:space="preserve"> = </w:t>
+      </w:r>
+      <w:proofErr w:type="spellStart"/>
+      <w:proofErr w:type="gramStart"/>
+      <w:r>
+        <w:t>document.getElementById</w:t>
+      </w:r>
+      <w:proofErr w:type="spellEnd"/>
+      <w:proofErr w:type="gramEnd"/>
+      <w:r>
+        <w:t>("final-score").value;</w:t>
+      </w:r>
+    </w:p>
+    <w:p>
+      <w:r>
+        <w:t xml:space="preserve">  const assignment = </w:t>
+      </w:r>
+      <w:proofErr w:type="spellStart"/>
+      <w:proofErr w:type="gramStart"/>
+      <w:r>
+        <w:t>document.getElementById</w:t>
+      </w:r>
+      <w:proofErr w:type="spellEnd"/>
+      <w:proofErr w:type="gramEnd"/>
+      <w:r>
+        <w:t>("assignment-score").value;</w:t>
+      </w:r>
+    </w:p>
+    <w:p/>
+    <w:p>
+      <w:r>
+        <w:t>  if (name === "" || subject === "") {</w:t>
+      </w:r>
+    </w:p>
+    <w:p>
+      <w:r>
+        <w:t xml:space="preserve">    </w:t>
+      </w:r>
+      <w:proofErr w:type="gramStart"/>
+      <w:r>
+        <w:t>alert(</w:t>
+      </w:r>
+      <w:proofErr w:type="gramEnd"/>
+      <w:r>
+        <w:t>"Please enter student name and subject");</w:t>
+      </w:r>
+    </w:p>
+    <w:p>
+      <w:r>
+        <w:t>    return;</w:t>
+      </w:r>
+    </w:p>
+    <w:p>
+      <w:r>
+        <w:t>  }</w:t>
+      </w:r>
+    </w:p>
+    <w:p/>
+    <w:p>
+      <w:r>
+        <w:t>  if (</w:t>
+      </w:r>
+    </w:p>
+    <w:p>
+      <w:r>
+        <w:t xml:space="preserve">    </w:t>
+      </w:r>
+      <w:proofErr w:type="spellStart"/>
+      <w:proofErr w:type="gramStart"/>
+      <w:r>
+        <w:t>isNaN</w:t>
+      </w:r>
+      <w:proofErr w:type="spellEnd"/>
+      <w:r>
+        <w:t>(</w:t>
+      </w:r>
+      <w:proofErr w:type="gramEnd"/>
+      <w:r>
+        <w:t>Number(midterm)) ||</w:t>
+      </w:r>
+    </w:p>
+    <w:p>
+      <w:r>
+        <w:t xml:space="preserve">    </w:t>
+      </w:r>
+      <w:proofErr w:type="spellStart"/>
+      <w:proofErr w:type="gramStart"/>
+      <w:r>
+        <w:t>isNaN</w:t>
+      </w:r>
+      <w:proofErr w:type="spellEnd"/>
+      <w:r>
+        <w:t>(</w:t>
+      </w:r>
+      <w:proofErr w:type="gramEnd"/>
+      <w:r>
+        <w:t>Number(</w:t>
+      </w:r>
+      <w:proofErr w:type="spellStart"/>
+      <w:r>
+        <w:t>finalScore</w:t>
+      </w:r>
+      <w:proofErr w:type="spellEnd"/>
+      <w:r>
+        <w:t>)) ||</w:t>
+      </w:r>
+    </w:p>
+    <w:p>
+      <w:r>
+        <w:t xml:space="preserve">    </w:t>
+      </w:r>
+      <w:proofErr w:type="spellStart"/>
+      <w:proofErr w:type="gramStart"/>
+      <w:r>
+        <w:t>isNaN</w:t>
+      </w:r>
+      <w:proofErr w:type="spellEnd"/>
+      <w:r>
+        <w:t>(</w:t>
+      </w:r>
+      <w:proofErr w:type="gramEnd"/>
+      <w:r>
+        <w:t>Number(assignment))</w:t>
+      </w:r>
+    </w:p>
+    <w:p>
+      <w:r>
+        <w:t>  ) {</w:t>
+      </w:r>
+    </w:p>
+    <w:p>
+      <w:r>
+        <w:lastRenderedPageBreak/>
+        <w:t xml:space="preserve">    </w:t>
+      </w:r>
+      <w:proofErr w:type="gramStart"/>
+      <w:r>
+        <w:t>alert(</w:t>
+      </w:r>
+      <w:proofErr w:type="gramEnd"/>
+      <w:r>
+        <w:t>"Please enter valid numbers only");</w:t>
+      </w:r>
+    </w:p>
+    <w:p>
+      <w:r>
+        <w:t>    return;</w:t>
+      </w:r>
+    </w:p>
+    <w:p>
+      <w:r>
+        <w:t>  }</w:t>
+      </w:r>
+    </w:p>
+    <w:p/>
+    <w:p>
+      <w:r>
+        <w:t>  if (</w:t>
+      </w:r>
+    </w:p>
+    <w:p>
+      <w:r>
+        <w:t xml:space="preserve">    </w:t>
+      </w:r>
+      <w:proofErr w:type="gramStart"/>
+      <w:r>
+        <w:t>!</w:t>
+      </w:r>
+      <w:proofErr w:type="spellStart"/>
+      <w:r>
+        <w:t>validateScore</w:t>
+      </w:r>
+      <w:proofErr w:type="spellEnd"/>
+      <w:proofErr w:type="gramEnd"/>
+      <w:r>
+        <w:t>(midterm) ||</w:t>
+      </w:r>
+    </w:p>
+    <w:p>
+      <w:r>
+        <w:t xml:space="preserve">    </w:t>
+      </w:r>
+      <w:proofErr w:type="gramStart"/>
+      <w:r>
+        <w:t>!</w:t>
+      </w:r>
+      <w:proofErr w:type="spellStart"/>
+      <w:r>
+        <w:t>validateScore</w:t>
+      </w:r>
+      <w:proofErr w:type="spellEnd"/>
+      <w:proofErr w:type="gramEnd"/>
+      <w:r>
+        <w:t>(</w:t>
+      </w:r>
+      <w:proofErr w:type="spellStart"/>
+      <w:r>
+        <w:t>finalScore</w:t>
+      </w:r>
+      <w:proofErr w:type="spellEnd"/>
+      <w:r>
+        <w:t>) ||</w:t>
+      </w:r>
+    </w:p>
+    <w:p>
+      <w:r>
+        <w:t xml:space="preserve">    </w:t>
+      </w:r>
+      <w:proofErr w:type="gramStart"/>
+      <w:r>
+        <w:t>!</w:t>
+      </w:r>
+      <w:proofErr w:type="spellStart"/>
+      <w:r>
+        <w:t>validateScore</w:t>
+      </w:r>
+      <w:proofErr w:type="spellEnd"/>
+      <w:proofErr w:type="gramEnd"/>
+      <w:r>
+        <w:t>(assignment)</w:t>
+      </w:r>
+    </w:p>
+    <w:p>
+      <w:r>
+        <w:t>  ) {</w:t>
+      </w:r>
+    </w:p>
+    <w:p>
+      <w:r>
+        <w:t xml:space="preserve">    </w:t>
+      </w:r>
+      <w:proofErr w:type="gramStart"/>
+      <w:r>
+        <w:t>alert(</w:t>
+      </w:r>
+      <w:proofErr w:type="gramEnd"/>
+      <w:r>
+        <w:t>"All scores must be between 0-100");</w:t>
+      </w:r>
+    </w:p>
+    <w:p>
+      <w:r>
+        <w:t>    return;</w:t>
+      </w:r>
+    </w:p>
+    <w:p>
+      <w:r>
+        <w:t>  }</w:t>
+      </w:r>
+    </w:p>
+    <w:p/>
+    <w:p>
+      <w:r>
+        <w:t xml:space="preserve">  const </w:t>
+      </w:r>
+      <w:proofErr w:type="spellStart"/>
+      <w:r>
+        <w:t>totalScore</w:t>
+      </w:r>
+      <w:proofErr w:type="spellEnd"/>
+      <w:r>
+        <w:t xml:space="preserve"> = </w:t>
+      </w:r>
+      <w:proofErr w:type="spellStart"/>
+      <w:proofErr w:type="gramStart"/>
+      <w:r>
+        <w:t>calculateScore</w:t>
+      </w:r>
+      <w:proofErr w:type="spellEnd"/>
+      <w:r>
+        <w:t>(</w:t>
+      </w:r>
+      <w:proofErr w:type="gramEnd"/>
+    </w:p>
+    <w:p>
+      <w:r>
+        <w:t>    Number(midterm),</w:t>
+      </w:r>
+    </w:p>
+    <w:p>
+      <w:r>
+        <w:t>    Number(</w:t>
+      </w:r>
+      <w:proofErr w:type="spellStart"/>
+      <w:r>
+        <w:t>finalScore</w:t>
+      </w:r>
+      <w:proofErr w:type="spellEnd"/>
+      <w:r>
+        <w:t>),</w:t>
+      </w:r>
+    </w:p>
+    <w:p>
+      <w:r>
+        <w:t>    Number(assignment)</w:t>
+      </w:r>
+    </w:p>
+    <w:p>
+      <w:r>
+        <w:t>  );</w:t>
+      </w:r>
+    </w:p>
+    <w:p/>
+    <w:p>
+      <w:r>
+        <w:t xml:space="preserve">  const grade = </w:t>
+      </w:r>
+      <w:proofErr w:type="spellStart"/>
+      <w:r>
+        <w:t>getGrade</w:t>
+      </w:r>
+      <w:proofErr w:type="spellEnd"/>
+      <w:r>
+        <w:t>(</w:t>
+      </w:r>
+      <w:proofErr w:type="spellStart"/>
+      <w:r>
+        <w:t>totalScore</w:t>
+      </w:r>
+      <w:proofErr w:type="spellEnd"/>
+      <w:r>
+        <w:t>);</w:t>
+      </w:r>
+    </w:p>
+    <w:p/>
+    <w:p>
+      <w:r>
+        <w:t>  // 5. Get Status</w:t>
+      </w:r>
+    </w:p>
+    <w:p>
+      <w:r>
+        <w:t xml:space="preserve">  const status = </w:t>
+      </w:r>
+      <w:proofErr w:type="spellStart"/>
+      <w:r>
+        <w:t>getStatus</w:t>
+      </w:r>
+      <w:proofErr w:type="spellEnd"/>
+      <w:r>
+        <w:t>(grade);</w:t>
+      </w:r>
+    </w:p>
+    <w:p/>
+    <w:p>
+      <w:r>
+        <w:t xml:space="preserve">  </w:t>
+      </w:r>
+      <w:proofErr w:type="gramStart"/>
+      <w:r>
+        <w:t>alert(</w:t>
+      </w:r>
+      <w:proofErr w:type="gramEnd"/>
+    </w:p>
+    <w:p>
+      <w:r>
+        <w:t xml:space="preserve">    "Score: " + </w:t>
+      </w:r>
+      <w:proofErr w:type="spellStart"/>
+      <w:r>
+        <w:t>totalScore</w:t>
+      </w:r>
+      <w:proofErr w:type="spellEnd"/>
+      <w:r>
+        <w:t xml:space="preserve"> +</w:t>
+      </w:r>
+    </w:p>
+    <w:p>
+      <w:r>
+        <w:t>    "\</w:t>
+      </w:r>
+      <w:proofErr w:type="spellStart"/>
+      <w:r>
+        <w:t>nGrade</w:t>
+      </w:r>
+      <w:proofErr w:type="spellEnd"/>
+      <w:r>
+        <w:t>: " + grade +</w:t>
+      </w:r>
+    </w:p>
+    <w:p>
+      <w:r>
+        <w:t>    "\</w:t>
+      </w:r>
+      <w:proofErr w:type="spellStart"/>
+      <w:r>
+        <w:t>nStatus</w:t>
+      </w:r>
+      <w:proofErr w:type="spellEnd"/>
+      <w:r>
+        <w:t>: " + status</w:t>
+      </w:r>
+    </w:p>
+    <w:p>
+      <w:r>
+        <w:t>  );</w:t>
+      </w:r>
+    </w:p>
+    <w:p/>
+    <w:p>
+      <w:r>
+        <w:t>  const data = {</w:t>
+      </w:r>
+    </w:p>
+    <w:p>
+      <w:r>
+        <w:lastRenderedPageBreak/>
+        <w:t>    name: name,</w:t>
+      </w:r>
+    </w:p>
+    <w:p>
+      <w:r>
+        <w:t>    subject: subject,</w:t>
+      </w:r>
+    </w:p>
+    <w:p>
+      <w:r>
+        <w:t>    midterm: Number(midterm),</w:t>
+      </w:r>
+    </w:p>
+    <w:p>
+      <w:r>
+        <w:t>    final: Number(</w:t>
+      </w:r>
+      <w:proofErr w:type="spellStart"/>
+      <w:r>
+        <w:t>finalScore</w:t>
+      </w:r>
+      <w:proofErr w:type="spellEnd"/>
+      <w:r>
+        <w:t>),</w:t>
+      </w:r>
+    </w:p>
+    <w:p>
+      <w:r>
+        <w:t>    assignment: Number(assignment),</w:t>
+      </w:r>
+    </w:p>
+    <w:p>
+      <w:r>
+        <w:t xml:space="preserve">    score: </w:t>
+      </w:r>
+      <w:proofErr w:type="spellStart"/>
+      <w:r>
+        <w:t>totalScore</w:t>
+      </w:r>
+      <w:proofErr w:type="spellEnd"/>
+      <w:r>
+        <w:t>,</w:t>
+      </w:r>
+    </w:p>
+    <w:p>
+      <w:r>
+        <w:t>    grade: grade,</w:t>
+      </w:r>
+    </w:p>
+    <w:p>
+      <w:r>
+        <w:t>    status: status</w:t>
+      </w:r>
+    </w:p>
+    <w:p>
+      <w:r>
+        <w:t>  };</w:t>
+      </w:r>
+    </w:p>
+    <w:p/>
+    <w:p>
+      <w:r>
+        <w:t xml:space="preserve">  </w:t>
+      </w:r>
+      <w:proofErr w:type="spellStart"/>
+      <w:r>
+        <w:t>saveToStorage</w:t>
+      </w:r>
+      <w:proofErr w:type="spellEnd"/>
+      <w:r>
+        <w:t>(data);</w:t>
+      </w:r>
+    </w:p>
+    <w:p/>
+    <w:p>
+      <w:r>
+        <w:t xml:space="preserve">   const </w:t>
+      </w:r>
+      <w:proofErr w:type="spellStart"/>
+      <w:r>
+        <w:t>allData</w:t>
+      </w:r>
+      <w:proofErr w:type="spellEnd"/>
+      <w:r>
+        <w:t xml:space="preserve"> = </w:t>
+      </w:r>
+      <w:proofErr w:type="spellStart"/>
+      <w:proofErr w:type="gramStart"/>
+      <w:r>
+        <w:t>loadFromStorage</w:t>
+      </w:r>
+      <w:proofErr w:type="spellEnd"/>
+      <w:r>
+        <w:t>(</w:t>
+      </w:r>
+      <w:proofErr w:type="gramEnd"/>
+      <w:r>
+        <w:t>);</w:t>
+      </w:r>
+    </w:p>
+    <w:p>
+      <w:r>
+        <w:t xml:space="preserve">  </w:t>
+      </w:r>
+      <w:proofErr w:type="spellStart"/>
+      <w:r>
+        <w:t>renderResults</w:t>
+      </w:r>
+      <w:proofErr w:type="spellEnd"/>
+      <w:r>
+        <w:t>(</w:t>
+      </w:r>
+      <w:proofErr w:type="spellStart"/>
+      <w:r>
+        <w:t>allData</w:t>
+      </w:r>
+      <w:proofErr w:type="spellEnd"/>
+      <w:r>
+        <w:t>);</w:t>
+      </w:r>
+    </w:p>
+    <w:p>
+      <w:r>
+        <w:t>}</w:t>
+      </w:r>
+    </w:p>
+    <w:p/>
+    <w:p>
+      <w:r>
+        <w:lastRenderedPageBreak/>
+        <w:drawing>
+          <wp:inline distT="0" distB="0" distL="0" distR="0" wp14:anchorId="449BDF5F" wp14:editId="70D354E6">
+            <wp:extent cx="5731510" cy="7698105"/>
+            <wp:effectExtent l="0" t="0" r="2540" b="0"/>
+            <wp:docPr id="8" name="Picture 8"/>
+            <wp:cNvGraphicFramePr>
+              <a:graphicFrameLocks xmlns:a="http://schemas.openxmlformats.org/drawingml/2006/main" noChangeAspect="1"/>
+            </wp:cNvGraphicFramePr>
+            <a:graphic xmlns:a="http://schemas.openxmlformats.org/drawingml/2006/main">
+              <a:graphicData uri="http://schemas.openxmlformats.org/drawingml/2006/picture">
+                <pic:pic xmlns:pic="http://schemas.openxmlformats.org/drawingml/2006/picture">
+                  <pic:nvPicPr>
+                    <pic:cNvPr id="1" name=""/>
+                    <pic:cNvPicPr/>
+                  </pic:nvPicPr>
+                  <pic:blipFill>
+                    <a:blip r:embed="rId13"/>
+                    <a:stretch>
+                      <a:fillRect/>
+                    </a:stretch>
+                  </pic:blipFill>
+                  <pic:spPr>
+                    <a:xfrm>
+                      <a:off x="0" y="0"/>
+                      <a:ext cx="5731510" cy="7698105"/>
+                    </a:xfrm>
+                    <a:prstGeom prst="rect">
+                      <a:avLst/>
+                    </a:prstGeom>
+                  </pic:spPr>
+                </pic:pic>
+              </a:graphicData>
+            </a:graphic>
+          </wp:inline>
+        </w:drawing>
+      </w:r>
+    </w:p>
+    <w:p/>
+    <w:p>
+      <w:r>
+        <w:rPr>
+          <w:rFonts w:hint="cs"/>
+          <w:cs/>
+        </w:rPr>
+        <w:t>2.8</w:t>
+      </w:r>
+      <w:r>
+        <w:t xml:space="preserve"> </w:t>
+      </w:r>
+      <w:r>
+        <w:t xml:space="preserve">function </w:t>
+      </w:r>
+      <w:proofErr w:type="spellStart"/>
+      <w:r>
+        <w:t>handleClear</w:t>
+      </w:r>
+      <w:proofErr w:type="spellEnd"/>
+      <w:r>
+        <w:t>() {</w:t>
+      </w:r>
+    </w:p>
+    <w:p>
+      <w:r>
+        <w:t xml:space="preserve">  </w:t>
+      </w:r>
+      <w:proofErr w:type="spellStart"/>
+      <w:proofErr w:type="gramStart"/>
+      <w:r>
+        <w:t>document.getElementById</w:t>
+      </w:r>
+      <w:proofErr w:type="spellEnd"/>
+      <w:proofErr w:type="gramEnd"/>
+      <w:r>
+        <w:t>("student-name").value = "";</w:t>
+      </w:r>
+    </w:p>
+    <w:p>
+      <w:r>
+        <w:lastRenderedPageBreak/>
+        <w:t xml:space="preserve">  </w:t>
+      </w:r>
+      <w:proofErr w:type="spellStart"/>
+      <w:proofErr w:type="gramStart"/>
+      <w:r>
+        <w:t>document.getElementById</w:t>
+      </w:r>
+      <w:proofErr w:type="spellEnd"/>
+      <w:proofErr w:type="gramEnd"/>
+      <w:r>
+        <w:t>("subject-name").value = "";</w:t>
+      </w:r>
+    </w:p>
+    <w:p>
+      <w:r>
+        <w:t xml:space="preserve">  </w:t>
+      </w:r>
+      <w:proofErr w:type="spellStart"/>
+      <w:proofErr w:type="gramStart"/>
+      <w:r>
+        <w:t>document.getElementById</w:t>
+      </w:r>
+      <w:proofErr w:type="spellEnd"/>
+      <w:proofErr w:type="gramEnd"/>
+      <w:r>
+        <w:t>("midterm-score").value = "";</w:t>
+      </w:r>
+    </w:p>
+    <w:p>
+      <w:r>
+        <w:t xml:space="preserve">  </w:t>
+      </w:r>
+      <w:proofErr w:type="spellStart"/>
+      <w:proofErr w:type="gramStart"/>
+      <w:r>
+        <w:t>document.getElementById</w:t>
+      </w:r>
+      <w:proofErr w:type="spellEnd"/>
+      <w:proofErr w:type="gramEnd"/>
+      <w:r>
+        <w:t>("final-score").value = "";</w:t>
+      </w:r>
+    </w:p>
+    <w:p>
+      <w:r>
+        <w:t xml:space="preserve">  </w:t>
+      </w:r>
+      <w:proofErr w:type="spellStart"/>
+      <w:proofErr w:type="gramStart"/>
+      <w:r>
+        <w:t>document.getElementById</w:t>
+      </w:r>
+      <w:proofErr w:type="spellEnd"/>
+      <w:proofErr w:type="gramEnd"/>
+      <w:r>
+        <w:t>("assignment-score").value = "";</w:t>
+      </w:r>
+    </w:p>
+    <w:p/>
+    <w:p>
+      <w:r>
+        <w:t xml:space="preserve">  </w:t>
+      </w:r>
+      <w:proofErr w:type="spellStart"/>
+      <w:proofErr w:type="gramStart"/>
+      <w:r>
+        <w:t>document.getElementById</w:t>
+      </w:r>
+      <w:proofErr w:type="spellEnd"/>
+      <w:proofErr w:type="gramEnd"/>
+      <w:r>
+        <w:t>("result-container").</w:t>
+      </w:r>
+      <w:proofErr w:type="spellStart"/>
+      <w:r>
+        <w:t>style.display</w:t>
+      </w:r>
+      <w:proofErr w:type="spellEnd"/>
+      <w:r>
+        <w:t xml:space="preserve"> = "none";</w:t>
+      </w:r>
+    </w:p>
+    <w:p>
+      <w:r>
+        <w:t>}</w:t>
+      </w:r>
+    </w:p>
+    <w:p>
+      <w:proofErr w:type="spellStart"/>
+      <w:proofErr w:type="gramStart"/>
+      <w:r>
+        <w:t>document.getElementById</w:t>
+      </w:r>
+      <w:proofErr w:type="spellEnd"/>
+      <w:proofErr w:type="gramEnd"/>
+      <w:r>
+        <w:t>("</w:t>
+      </w:r>
+      <w:proofErr w:type="spellStart"/>
+      <w:r>
+        <w:t>btn</w:t>
+      </w:r>
+      <w:proofErr w:type="spellEnd"/>
+      <w:r>
+        <w:t>-clear")</w:t>
+      </w:r>
+    </w:p>
+    <w:p>
+      <w:r>
+        <w:t xml:space="preserve">  </w:t>
+      </w:r>
+      <w:proofErr w:type="gramStart"/>
+      <w:r>
+        <w:t>.</w:t>
+      </w:r>
+      <w:proofErr w:type="spellStart"/>
+      <w:r>
+        <w:t>addEventListener</w:t>
+      </w:r>
+      <w:proofErr w:type="spellEnd"/>
+      <w:proofErr w:type="gramEnd"/>
+      <w:r>
+        <w:t xml:space="preserve">("click", </w:t>
+      </w:r>
+      <w:proofErr w:type="spellStart"/>
+      <w:r>
+        <w:t>handleClear</w:t>
+      </w:r>
+      <w:proofErr w:type="spellEnd"/>
+      <w:r>
+        <w:t xml:space="preserve">); </w:t>
+      </w:r>
+    </w:p>
+    <w:p>
+      <w:r>
+        <w:t>&lt;/script&gt;</w:t>
+      </w:r>
+    </w:p>
+    <w:p/>
+    <w:p/>
+    <w:p>
+      <w:r>
+        <w:rPr>
+          <w:rFonts w:cs="Cordia New"/>
+          <w:cs/>
+        </w:rPr>
+        <w:drawing>
+          <wp:inline distT="0" distB="0" distL="0" distR="0" wp14:anchorId="452502C2" wp14:editId="3E54D4E8">
+            <wp:extent cx="5731510" cy="4659464"/>
+            <wp:effectExtent l="0" t="0" r="2540" b="8255"/>
+            <wp:docPr id="9" name="Picture 9"/>
+            <wp:cNvGraphicFramePr>
+              <a:graphicFrameLocks xmlns:a="http://schemas.openxmlformats.org/drawingml/2006/main" noChangeAspect="1"/>
+            </wp:cNvGraphicFramePr>
+            <a:graphic xmlns:a="http://schemas.openxmlformats.org/drawingml/2006/main">
+              <a:graphicData uri="http://schemas.openxmlformats.org/drawingml/2006/picture">
+                <pic:pic xmlns:pic="http://schemas.openxmlformats.org/drawingml/2006/picture">
+                  <pic:nvPicPr>
+                    <pic:cNvPr id="1" name=""/>
+                    <pic:cNvPicPr/>
+                  </pic:nvPicPr>
+                  <pic:blipFill>
+                    <a:blip r:embed="rId14"/>
+                    <a:stretch>
+                      <a:fillRect/>
+                    </a:stretch>
+                  </pic:blipFill>
+                  <pic:spPr>
+                    <a:xfrm>
+                      <a:off x="0" y="0"/>
+                      <a:ext cx="5733585" cy="4661151"/>
+                    </a:xfrm>
+                    <a:prstGeom prst="rect">
+                      <a:avLst/>
+                    </a:prstGeom>
+                  </pic:spPr>
+                </pic:pic>
+              </a:graphicData>
+            </a:graphic>
+          </wp:inline>
+        </w:drawing>
+      </w:r>
+    </w:p>
+    <w:p/>
+    <w:p/>
+    <w:p>
+      <w:r>
+        <w:lastRenderedPageBreak/>
+        <w:drawing>
+          <wp:inline distT="0" distB="0" distL="0" distR="0" wp14:anchorId="741082DB" wp14:editId="3878FE0D">
+            <wp:extent cx="5725324" cy="1667108"/>
+            <wp:effectExtent l="0" t="0" r="0" b="9525"/>
+            <wp:docPr id="10" name="Picture 10"/>
+            <wp:cNvGraphicFramePr>
+              <a:graphicFrameLocks xmlns:a="http://schemas.openxmlformats.org/drawingml/2006/main" noChangeAspect="1"/>
+            </wp:cNvGraphicFramePr>
+            <a:graphic xmlns:a="http://schemas.openxmlformats.org/drawingml/2006/main">
+              <a:graphicData uri="http://schemas.openxmlformats.org/drawingml/2006/picture">
+                <pic:pic xmlns:pic="http://schemas.openxmlformats.org/drawingml/2006/picture">
+                  <pic:nvPicPr>
+                    <pic:cNvPr id="1" name=""/>
+                    <pic:cNvPicPr/>
+                  </pic:nvPicPr>
+                  <pic:blipFill>
+                    <a:blip r:embed="rId15"/>
+                    <a:stretch>
+                      <a:fillRect/>
+                    </a:stretch>
+                  </pic:blipFill>
+                  <pic:spPr>
+                    <a:xfrm>
+                      <a:off x="0" y="0"/>
+                      <a:ext cx="5725324" cy="1667108"/>
+                    </a:xfrm>
+                    <a:prstGeom prst="rect">
+                      <a:avLst/>
+                    </a:prstGeom>
+                  </pic:spPr>
+                </pic:pic>
+              </a:graphicData>
+            </a:graphic>
+          </wp:inline>
+        </w:drawing>
+      </w:r>
+    </w:p>
+    <w:p>
+      <w:pPr>
+        <w:rPr>
+          <w:rFonts w:hint="cs"/>
+          <w:cs/>
+        </w:rPr>
+      </w:pPr>
+    </w:p>
     <w:sectPr>
+      <w:headerReference w:type="default" r:id="rId16"/>
       <w:pgSz w:w="11906" w:h="16838"/>
       <w:pgMar w:top="1440" w:right="1440" w:bottom="1440" w:left="1440" w:header="708" w:footer="708" w:gutter="0"/>
       <w:cols w:space="708"/>
@@ -11,6 +2989,112 @@
     </w:sectPr>
   </w:body>
 </w:document>
+</file>
+
+<file path=word/endnotes.xml><?xml version="1.0" encoding="utf-8"?>
+<w:endnotes xmlns:wpc="http://schemas.microsoft.com/office/word/2010/wordprocessingCanvas" xmlns:cx="http://schemas.microsoft.com/office/drawing/2014/chartex" xmlns:cx1="http://schemas.microsoft.com/office/drawing/2015/9/8/chartex" xmlns:cx2="http://schemas.microsoft.com/office/drawing/2015/10/21/chartex" xmlns:cx3="http://schemas.microsoft.com/office/drawing/2016/5/9/chartex" xmlns:cx4="http://schemas.microsoft.com/office/drawing/2016/5/10/chartex" xmlns:cx5="http://schemas.microsoft.com/office/drawing/2016/5/11/chartex" xmlns:cx6="http://schemas.microsoft.com/office/drawing/2016/5/12/chartex" xmlns:cx7="http://schemas.microsoft.com/office/drawing/2016/5/13/chartex" xmlns:cx8="http://schemas.microsoft.com/office/drawing/2016/5/14/chartex" xmlns:mc="http://schemas.openxmlformats.org/markup-compatibility/2006" xmlns:aink="http://schemas.microsoft.com/office/drawing/2016/ink" xmlns:am3d="http://schemas.microsoft.com/office/drawing/2017/model3d" xmlns:o="urn:schemas-microsoft-com:office:office" xmlns:oel="http://schemas.microsoft.com/office/2019/extlst" xmlns:r="http://schemas.openxmlformats.org/officeDocument/2006/relationships" xmlns:m="http://schemas.openxmlformats.org/officeDocument/2006/math" xmlns:v="urn:schemas-microsoft-com:vml" xmlns:wp14="http://schemas.microsoft.com/office/word/2010/wordprocessingDrawing" xmlns:wp="http://schemas.openxmlformats.org/drawingml/2006/wordprocessingDrawing" xmlns:w10="urn:schemas-microsoft-com:office:word" xmlns:w="http://schemas.openxmlformats.org/wordprocessingml/2006/main" xmlns:w14="http://schemas.microsoft.com/office/word/2010/wordml" xmlns:w15="http://schemas.microsoft.com/office/word/2012/wordml" xmlns:w16cex="http://schemas.microsoft.com/office/word/2018/wordml/cex" xmlns:w16cid="http://schemas.microsoft.com/office/word/2016/wordml/cid" xmlns:w16="http://schemas.microsoft.com/office/word/2018/wordml" xmlns:w16sdtdh="http://schemas.microsoft.com/office/word/2020/wordml/sdtdatahash" xmlns:w16se="http://schemas.microsoft.com/office/word/2015/wordml/symex" xmlns:wpg="http://schemas.microsoft.com/office/word/2010/wordprocessingGroup" xmlns:wpi="http://schemas.microsoft.com/office/word/2010/wordprocessingInk" xmlns:wne="http://schemas.microsoft.com/office/word/2006/wordml" xmlns:wps="http://schemas.microsoft.com/office/word/2010/wordprocessingShape" mc:Ignorable="w14 w15 w16se w16cid w16 w16cex w16sdtdh wp14">
+  <w:endnote w:type="separator" w:id="-1">
+    <w:p>
+      <w:pPr>
+        <w:spacing w:after="0" w:line="240" w:lineRule="auto"/>
+      </w:pPr>
+      <w:r>
+        <w:separator/>
+      </w:r>
+    </w:p>
+  </w:endnote>
+  <w:endnote w:type="continuationSeparator" w:id="0">
+    <w:p>
+      <w:pPr>
+        <w:spacing w:after="0" w:line="240" w:lineRule="auto"/>
+      </w:pPr>
+      <w:r>
+        <w:continuationSeparator/>
+      </w:r>
+    </w:p>
+  </w:endnote>
+</w:endnotes>
+</file>
+
+<file path=word/footnotes.xml><?xml version="1.0" encoding="utf-8"?>
+<w:footnotes xmlns:wpc="http://schemas.microsoft.com/office/word/2010/wordprocessingCanvas" xmlns:cx="http://schemas.microsoft.com/office/drawing/2014/chartex" xmlns:cx1="http://schemas.microsoft.com/office/drawing/2015/9/8/chartex" xmlns:cx2="http://schemas.microsoft.com/office/drawing/2015/10/21/chartex" xmlns:cx3="http://schemas.microsoft.com/office/drawing/2016/5/9/chartex" xmlns:cx4="http://schemas.microsoft.com/office/drawing/2016/5/10/chartex" xmlns:cx5="http://schemas.microsoft.com/office/drawing/2016/5/11/chartex" xmlns:cx6="http://schemas.microsoft.com/office/drawing/2016/5/12/chartex" xmlns:cx7="http://schemas.microsoft.com/office/drawing/2016/5/13/chartex" xmlns:cx8="http://schemas.microsoft.com/office/drawing/2016/5/14/chartex" xmlns:mc="http://schemas.openxmlformats.org/markup-compatibility/2006" xmlns:aink="http://schemas.microsoft.com/office/drawing/2016/ink" xmlns:am3d="http://schemas.microsoft.com/office/drawing/2017/model3d" xmlns:o="urn:schemas-microsoft-com:office:office" xmlns:oel="http://schemas.microsoft.com/office/2019/extlst" xmlns:r="http://schemas.openxmlformats.org/officeDocument/2006/relationships" xmlns:m="http://schemas.openxmlformats.org/officeDocument/2006/math" xmlns:v="urn:schemas-microsoft-com:vml" xmlns:wp14="http://schemas.microsoft.com/office/word/2010/wordprocessingDrawing" xmlns:wp="http://schemas.openxmlformats.org/drawingml/2006/wordprocessingDrawing" xmlns:w10="urn:schemas-microsoft-com:office:word" xmlns:w="http://schemas.openxmlformats.org/wordprocessingml/2006/main" xmlns:w14="http://schemas.microsoft.com/office/word/2010/wordml" xmlns:w15="http://schemas.microsoft.com/office/word/2012/wordml" xmlns:w16cex="http://schemas.microsoft.com/office/word/2018/wordml/cex" xmlns:w16cid="http://schemas.microsoft.com/office/word/2016/wordml/cid" xmlns:w16="http://schemas.microsoft.com/office/word/2018/wordml" xmlns:w16sdtdh="http://schemas.microsoft.com/office/word/2020/wordml/sdtdatahash" xmlns:w16se="http://schemas.microsoft.com/office/word/2015/wordml/symex" xmlns:wpg="http://schemas.microsoft.com/office/word/2010/wordprocessingGroup" xmlns:wpi="http://schemas.microsoft.com/office/word/2010/wordprocessingInk" xmlns:wne="http://schemas.microsoft.com/office/word/2006/wordml" xmlns:wps="http://schemas.microsoft.com/office/word/2010/wordprocessingShape" mc:Ignorable="w14 w15 w16se w16cid w16 w16cex w16sdtdh wp14">
+  <w:footnote w:type="separator" w:id="-1">
+    <w:p>
+      <w:pPr>
+        <w:spacing w:after="0" w:line="240" w:lineRule="auto"/>
+      </w:pPr>
+      <w:r>
+        <w:separator/>
+      </w:r>
+    </w:p>
+  </w:footnote>
+  <w:footnote w:type="continuationSeparator" w:id="0">
+    <w:p>
+      <w:pPr>
+        <w:spacing w:after="0" w:line="240" w:lineRule="auto"/>
+      </w:pPr>
+      <w:r>
+        <w:continuationSeparator/>
+      </w:r>
+    </w:p>
+  </w:footnote>
+</w:footnotes>
+</file>
+
+<file path=word/header1.xml><?xml version="1.0" encoding="utf-8"?>
+<w:hdr xmlns:wpc="http://schemas.microsoft.com/office/word/2010/wordprocessingCanvas" xmlns:cx="http://schemas.microsoft.com/office/drawing/2014/chartex" xmlns:cx1="http://schemas.microsoft.com/office/drawing/2015/9/8/chartex" xmlns:cx2="http://schemas.microsoft.com/office/drawing/2015/10/21/chartex" xmlns:cx3="http://schemas.microsoft.com/office/drawing/2016/5/9/chartex" xmlns:cx4="http://schemas.microsoft.com/office/drawing/2016/5/10/chartex" xmlns:cx5="http://schemas.microsoft.com/office/drawing/2016/5/11/chartex" xmlns:cx6="http://schemas.microsoft.com/office/drawing/2016/5/12/chartex" xmlns:cx7="http://schemas.microsoft.com/office/drawing/2016/5/13/chartex" xmlns:cx8="http://schemas.microsoft.com/office/drawing/2016/5/14/chartex" xmlns:mc="http://schemas.openxmlformats.org/markup-compatibility/2006" xmlns:aink="http://schemas.microsoft.com/office/drawing/2016/ink" xmlns:am3d="http://schemas.microsoft.com/office/drawing/2017/model3d" xmlns:o="urn:schemas-microsoft-com:office:office" xmlns:oel="http://schemas.microsoft.com/office/2019/extlst" xmlns:r="http://schemas.openxmlformats.org/officeDocument/2006/relationships" xmlns:m="http://schemas.openxmlformats.org/officeDocument/2006/math" xmlns:v="urn:schemas-microsoft-com:vml" xmlns:wp14="http://schemas.microsoft.com/office/word/2010/wordprocessingDrawing" xmlns:wp="http://schemas.openxmlformats.org/drawingml/2006/wordprocessingDrawing" xmlns:w10="urn:schemas-microsoft-com:office:word" xmlns:w="http://schemas.openxmlformats.org/wordprocessingml/2006/main" xmlns:w14="http://schemas.microsoft.com/office/word/2010/wordml" xmlns:w15="http://schemas.microsoft.com/office/word/2012/wordml" xmlns:w16cex="http://schemas.microsoft.com/office/word/2018/wordml/cex" xmlns:w16cid="http://schemas.microsoft.com/office/word/2016/wordml/cid" xmlns:w16="http://schemas.microsoft.com/office/word/2018/wordml" xmlns:w16sdtdh="http://schemas.microsoft.com/office/word/2020/wordml/sdtdatahash" xmlns:w16se="http://schemas.microsoft.com/office/word/2015/wordml/symex" xmlns:wpg="http://schemas.microsoft.com/office/word/2010/wordprocessingGroup" xmlns:wpi="http://schemas.microsoft.com/office/word/2010/wordprocessingInk" xmlns:wne="http://schemas.microsoft.com/office/word/2006/wordml" xmlns:wps="http://schemas.microsoft.com/office/word/2010/wordprocessingShape" mc:Ignorable="w14 w15 w16se w16cid w16 w16cex w16sdtdh wp14">
+  <w:p>
+    <w:pPr>
+      <w:pStyle w:val="Header"/>
+      <w:rPr>
+        <w:rFonts w:hint="cs"/>
+        <w:cs/>
+      </w:rPr>
+    </w:pPr>
+    <w:r>
+      <w:t xml:space="preserve">67160177 </w:t>
+    </w:r>
+    <w:r>
+      <w:rPr>
+        <w:rFonts w:hint="cs"/>
+        <w:cs/>
+      </w:rPr>
+      <w:t>กิตติพง</w:t>
+    </w:r>
+    <w:proofErr w:type="spellStart"/>
+    <w:r>
+      <w:rPr>
+        <w:rFonts w:hint="cs"/>
+        <w:cs/>
+      </w:rPr>
+      <w:t>ษ์</w:t>
+    </w:r>
+    <w:proofErr w:type="spellEnd"/>
+    <w:r>
+      <w:rPr>
+        <w:rFonts w:hint="cs"/>
+        <w:cs/>
+      </w:rPr>
+      <w:t xml:space="preserve"> </w:t>
+    </w:r>
+    <w:proofErr w:type="spellStart"/>
+    <w:r>
+      <w:rPr>
+        <w:rFonts w:hint="cs"/>
+        <w:cs/>
+      </w:rPr>
+      <w:t>สิมห</w:t>
+    </w:r>
+    <w:proofErr w:type="spellEnd"/>
+    <w:r>
+      <w:rPr>
+        <w:rFonts w:hint="cs"/>
+        <w:cs/>
+      </w:rPr>
+      <w:t>ล้า</w:t>
+    </w:r>
+  </w:p>
+</w:hdr>
 </file>
 
 <file path=word/styles.xml><?xml version="1.0" encoding="utf-8"?>
@@ -616,7 +3700,6 @@
   <w:style w:type="character" w:default="1" w:styleId="DefaultParagraphFont">
     <w:name w:val="Default Paragraph Font"/>
     <w:uiPriority w:val="1"/>
-    <w:semiHidden/>
     <w:unhideWhenUsed/>
   </w:style>
   <w:style w:type="table" w:default="1" w:styleId="TableNormal">
@@ -930,6 +4013,50 @@
       <w:spacing w:val="5"/>
     </w:rPr>
   </w:style>
+  <w:style w:type="paragraph" w:styleId="Header">
+    <w:name w:val="header"/>
+    <w:basedOn w:val="Normal"/>
+    <w:link w:val="HeaderChar"/>
+    <w:uiPriority w:val="99"/>
+    <w:unhideWhenUsed/>
+    <w:rsid w:val="00C7172D"/>
+    <w:pPr>
+      <w:tabs>
+        <w:tab w:val="center" w:pos="4513"/>
+        <w:tab w:val="right" w:pos="9026"/>
+      </w:tabs>
+      <w:spacing w:after="0" w:line="240" w:lineRule="auto"/>
+    </w:pPr>
+  </w:style>
+  <w:style w:type="character" w:customStyle="1" w:styleId="HeaderChar">
+    <w:name w:val="Header Char"/>
+    <w:basedOn w:val="DefaultParagraphFont"/>
+    <w:link w:val="Header"/>
+    <w:uiPriority w:val="99"/>
+    <w:rsid w:val="00C7172D"/>
+  </w:style>
+  <w:style w:type="paragraph" w:styleId="Footer">
+    <w:name w:val="footer"/>
+    <w:basedOn w:val="Normal"/>
+    <w:link w:val="FooterChar"/>
+    <w:uiPriority w:val="99"/>
+    <w:unhideWhenUsed/>
+    <w:rsid w:val="00C7172D"/>
+    <w:pPr>
+      <w:tabs>
+        <w:tab w:val="center" w:pos="4513"/>
+        <w:tab w:val="right" w:pos="9026"/>
+      </w:tabs>
+      <w:spacing w:after="0" w:line="240" w:lineRule="auto"/>
+    </w:pPr>
+  </w:style>
+  <w:style w:type="character" w:customStyle="1" w:styleId="FooterChar">
+    <w:name w:val="Footer Char"/>
+    <w:basedOn w:val="DefaultParagraphFont"/>
+    <w:link w:val="Footer"/>
+    <w:uiPriority w:val="99"/>
+    <w:rsid w:val="00C7172D"/>
+  </w:style>
 </w:styles>
 </file>
 

</xml_diff>